<commit_message>
imgs and error corrections
</commit_message>
<xml_diff>
--- a/content/CV_LM_20261025.docx
+++ b/content/CV_LM_20261025.docx
@@ -73,27 +73,7 @@
           <w:szCs w:val="24"/>
           <w:lang w:val="de-DE"/>
         </w:rPr>
-        <w:t xml:space="preserve">RWI Berlin Office, </w:t>
-      </w:r>
-      <w:proofErr w:type="spellStart"/>
-      <w:r>
-        <w:rPr>
-          <w:rFonts w:ascii="Georgia" w:eastAsia="Georgia" w:hAnsi="Georgia" w:cs="Georgia"/>
-          <w:sz w:val="24"/>
-          <w:szCs w:val="24"/>
-          <w:lang w:val="de-DE"/>
-        </w:rPr>
-        <w:t>Zinnowitzer</w:t>
-      </w:r>
-      <w:proofErr w:type="spellEnd"/>
-      <w:r>
-        <w:rPr>
-          <w:rFonts w:ascii="Georgia" w:eastAsia="Georgia" w:hAnsi="Georgia" w:cs="Georgia"/>
-          <w:sz w:val="24"/>
-          <w:szCs w:val="24"/>
-          <w:lang w:val="de-DE"/>
-        </w:rPr>
-        <w:t xml:space="preserve"> Str. 1, 10115 Berlin</w:t>
+        <w:t>RWI Berlin Office, Zinnowitzer Str. 1, 10115 Berlin</w:t>
       </w:r>
     </w:p>
     <w:p>
@@ -420,7 +400,6 @@
               <w:br/>
               <w:t xml:space="preserve">Ph.D. researcher in the </w:t>
             </w:r>
-            <w:proofErr w:type="spellStart"/>
             <w:r>
               <w:rPr>
                 <w:rFonts w:ascii="Georgia" w:eastAsia="Georgia" w:hAnsi="Georgia" w:cs="Georgia"/>
@@ -429,18 +408,7 @@
                 <w:sz w:val="21"/>
                 <w:szCs w:val="21"/>
               </w:rPr>
-              <w:t>FutureLab</w:t>
-            </w:r>
-            <w:proofErr w:type="spellEnd"/>
-            <w:r>
-              <w:rPr>
-                <w:rFonts w:ascii="Georgia" w:eastAsia="Georgia" w:hAnsi="Georgia" w:cs="Georgia"/>
-                <w:i/>
-                <w:iCs/>
-                <w:sz w:val="21"/>
-                <w:szCs w:val="21"/>
-              </w:rPr>
-              <w:t xml:space="preserve"> Inequality, Human Well-being, and Development</w:t>
+              <w:t>FutureLab Inequality, Human Well-being, and Development</w:t>
             </w:r>
           </w:p>
         </w:tc>
@@ -705,51 +673,7 @@
                 <w:sz w:val="21"/>
                 <w:szCs w:val="21"/>
               </w:rPr>
-              <w:t xml:space="preserve">Ph.D. in Economics (Dr. </w:t>
-            </w:r>
-            <w:proofErr w:type="spellStart"/>
-            <w:r>
-              <w:rPr>
-                <w:rFonts w:ascii="Georgia" w:eastAsia="Georgia" w:hAnsi="Georgia" w:cs="Georgia"/>
-                <w:b/>
-                <w:bCs/>
-                <w:sz w:val="21"/>
-                <w:szCs w:val="21"/>
-              </w:rPr>
-              <w:t>rer</w:t>
-            </w:r>
-            <w:proofErr w:type="spellEnd"/>
-            <w:r>
-              <w:rPr>
-                <w:rFonts w:ascii="Georgia" w:eastAsia="Georgia" w:hAnsi="Georgia" w:cs="Georgia"/>
-                <w:b/>
-                <w:bCs/>
-                <w:sz w:val="21"/>
-                <w:szCs w:val="21"/>
-              </w:rPr>
-              <w:t xml:space="preserve">. </w:t>
-            </w:r>
-            <w:proofErr w:type="spellStart"/>
-            <w:r>
-              <w:rPr>
-                <w:rFonts w:ascii="Georgia" w:eastAsia="Georgia" w:hAnsi="Georgia" w:cs="Georgia"/>
-                <w:b/>
-                <w:bCs/>
-                <w:sz w:val="21"/>
-                <w:szCs w:val="21"/>
-              </w:rPr>
-              <w:t>oec</w:t>
-            </w:r>
-            <w:proofErr w:type="spellEnd"/>
-            <w:r>
-              <w:rPr>
-                <w:rFonts w:ascii="Georgia" w:eastAsia="Georgia" w:hAnsi="Georgia" w:cs="Georgia"/>
-                <w:b/>
-                <w:bCs/>
-                <w:sz w:val="21"/>
-                <w:szCs w:val="21"/>
-              </w:rPr>
-              <w:t>.)</w:t>
+              <w:t>Ph.D. in Economics (Dr. rer. oec.)</w:t>
             </w:r>
             <w:r>
               <w:rPr>
@@ -1256,7 +1180,6 @@
             <w:r>
               <w:rPr>
                 <w:rFonts w:ascii="Georgia" w:eastAsia="Georgia" w:hAnsi="Georgia" w:cs="Georgia"/>
-                <w:color w:val="0070C0"/>
                 <w:sz w:val="21"/>
                 <w:szCs w:val="21"/>
                 <w:lang w:val="de-DE"/>
@@ -1307,23 +1230,7 @@
                 <w:sz w:val="21"/>
                 <w:szCs w:val="21"/>
               </w:rPr>
-              <w:t xml:space="preserve">DOI: </w:t>
-            </w:r>
-            <w:r>
-              <w:rPr>
-                <w:rFonts w:ascii="Georgia" w:eastAsia="Georgia" w:hAnsi="Georgia" w:cs="Georgia"/>
-                <w:sz w:val="21"/>
-                <w:szCs w:val="21"/>
-              </w:rPr>
-              <w:t>10.1086/735534</w:t>
-            </w:r>
-            <w:r>
-              <w:rPr>
-                <w:rFonts w:ascii="Georgia" w:eastAsia="Georgia" w:hAnsi="Georgia" w:cs="Georgia"/>
-                <w:sz w:val="21"/>
-                <w:szCs w:val="21"/>
-              </w:rPr>
-              <w:t xml:space="preserve">. </w:t>
+              <w:t xml:space="preserve">DOI: 10.1086/735534. </w:t>
             </w:r>
             <w:r>
               <w:rPr>
@@ -1499,54 +1406,10 @@
                 <w:color w:val="000000"/>
                 <w:sz w:val="21"/>
                 <w:szCs w:val="21"/>
-                <w:lang w:val="de-DE"/>
+                <w:lang w:val="en-US"/>
               </w:rPr>
               <w:lastRenderedPageBreak/>
-              <w:t xml:space="preserve">Mogge, L., McDonald, M., Knoth, C., </w:t>
-            </w:r>
-            <w:proofErr w:type="spellStart"/>
-            <w:r>
-              <w:rPr>
-                <w:rFonts w:ascii="Georgia" w:eastAsia="Georgia" w:hAnsi="Georgia" w:cs="Georgia"/>
-                <w:color w:val="000000"/>
-                <w:sz w:val="21"/>
-                <w:szCs w:val="21"/>
-                <w:lang w:val="de-DE"/>
-              </w:rPr>
-              <w:t>Teickner</w:t>
-            </w:r>
-            <w:proofErr w:type="spellEnd"/>
-            <w:r>
-              <w:rPr>
-                <w:rFonts w:ascii="Georgia" w:eastAsia="Georgia" w:hAnsi="Georgia" w:cs="Georgia"/>
-                <w:color w:val="000000"/>
-                <w:sz w:val="21"/>
-                <w:szCs w:val="21"/>
-                <w:lang w:val="de-DE"/>
-              </w:rPr>
-              <w:t xml:space="preserve">, H., Myagmartseren, P., </w:t>
-            </w:r>
-            <w:proofErr w:type="spellStart"/>
-            <w:r>
-              <w:rPr>
-                <w:rFonts w:ascii="Georgia" w:eastAsia="Georgia" w:hAnsi="Georgia" w:cs="Georgia"/>
-                <w:color w:val="000000"/>
-                <w:sz w:val="21"/>
-                <w:szCs w:val="21"/>
-                <w:lang w:val="de-DE"/>
-              </w:rPr>
-              <w:t>Pebesma</w:t>
-            </w:r>
-            <w:proofErr w:type="spellEnd"/>
-            <w:r>
-              <w:rPr>
-                <w:rFonts w:ascii="Georgia" w:eastAsia="Georgia" w:hAnsi="Georgia" w:cs="Georgia"/>
-                <w:color w:val="000000"/>
-                <w:sz w:val="21"/>
-                <w:szCs w:val="21"/>
-                <w:lang w:val="de-DE"/>
-              </w:rPr>
-              <w:t xml:space="preserve">, E. &amp; Kraehnert, K. (2023). </w:t>
+              <w:t xml:space="preserve">Mogge, L., McDonald, M., Knoth, C., Teickner, H., Myagmartseren, P., Pebesma, E. &amp; Kraehnert, K. (2023). </w:t>
             </w:r>
             <w:hyperlink r:id="rId10" w:history="1">
               <w:r>
@@ -1683,27 +1546,7 @@
                 <w:szCs w:val="21"/>
                 <w:lang w:val="de-DE"/>
               </w:rPr>
-              <w:t xml:space="preserve">Mogge, L., Roeckert, J., </w:t>
-            </w:r>
-            <w:proofErr w:type="spellStart"/>
-            <w:r>
-              <w:rPr>
-                <w:rFonts w:ascii="Georgia" w:eastAsia="Georgia" w:hAnsi="Georgia" w:cs="Georgia"/>
-                <w:sz w:val="21"/>
-                <w:szCs w:val="21"/>
-                <w:lang w:val="de-DE"/>
-              </w:rPr>
-              <w:t>Nshakira-Rukundo</w:t>
-            </w:r>
-            <w:proofErr w:type="spellEnd"/>
-            <w:r>
-              <w:rPr>
-                <w:rFonts w:ascii="Georgia" w:eastAsia="Georgia" w:hAnsi="Georgia" w:cs="Georgia"/>
-                <w:sz w:val="21"/>
-                <w:szCs w:val="21"/>
-                <w:lang w:val="de-DE"/>
-              </w:rPr>
-              <w:t>, E., &amp; Kraehnert, K. (202</w:t>
+              <w:t>Mogge, L., Roeckert, J., Nshakira-Rukundo, E., &amp; Kraehnert, K. (202</w:t>
             </w:r>
             <w:r>
               <w:rPr>
@@ -2064,29 +1907,7 @@
                 <w:szCs w:val="21"/>
                 <w:lang w:val="en-US"/>
               </w:rPr>
-              <w:t xml:space="preserve">Kraehnert, K., Habtemariam, L., </w:t>
-            </w:r>
-            <w:proofErr w:type="spellStart"/>
-            <w:r>
-              <w:rPr>
-                <w:rFonts w:ascii="Georgia" w:eastAsia="Georgia" w:hAnsi="Georgia" w:cs="Georgia"/>
-                <w:color w:val="000000"/>
-                <w:sz w:val="21"/>
-                <w:szCs w:val="21"/>
-                <w:lang w:val="en-US"/>
-              </w:rPr>
-              <w:t>Gornott</w:t>
-            </w:r>
-            <w:proofErr w:type="spellEnd"/>
-            <w:r>
-              <w:rPr>
-                <w:rFonts w:ascii="Georgia" w:eastAsia="Georgia" w:hAnsi="Georgia" w:cs="Georgia"/>
-                <w:color w:val="000000"/>
-                <w:sz w:val="21"/>
-                <w:szCs w:val="21"/>
-                <w:lang w:val="en-US"/>
-              </w:rPr>
-              <w:t>, C. &amp; Mogge, L. (2026</w:t>
+              <w:t>Kraehnert, K., Habtemariam, L., Gornott, C. &amp; Mogge, L. (2026</w:t>
             </w:r>
             <w:r>
               <w:rPr>
@@ -2132,25 +1953,7 @@
                 <w:sz w:val="21"/>
                 <w:szCs w:val="21"/>
               </w:rPr>
-              <w:t>(</w:t>
-            </w:r>
-            <w:proofErr w:type="spellStart"/>
-            <w:r>
-              <w:rPr>
-                <w:rFonts w:ascii="Georgia" w:eastAsia="Georgia" w:hAnsi="Georgia" w:cs="Georgia"/>
-                <w:sz w:val="21"/>
-                <w:szCs w:val="21"/>
-              </w:rPr>
-              <w:t>Carcavelos</w:t>
-            </w:r>
-            <w:proofErr w:type="spellEnd"/>
-            <w:r>
-              <w:rPr>
-                <w:rFonts w:ascii="Georgia" w:eastAsia="Georgia" w:hAnsi="Georgia" w:cs="Georgia"/>
-                <w:sz w:val="21"/>
-                <w:szCs w:val="21"/>
-              </w:rPr>
-              <w:t>, PT)</w:t>
+              <w:t>(Carcavelos, PT)</w:t>
             </w:r>
             <w:r>
               <w:rPr>
@@ -2184,27 +1987,7 @@
                 <w:szCs w:val="21"/>
                 <w:lang w:val="en-US"/>
               </w:rPr>
-              <w:t xml:space="preserve">Huntington-Klein, N., </w:t>
-            </w:r>
-            <w:proofErr w:type="spellStart"/>
-            <w:r>
-              <w:rPr>
-                <w:rFonts w:ascii="Georgia" w:eastAsia="Georgia" w:hAnsi="Georgia" w:cs="Georgia"/>
-                <w:sz w:val="21"/>
-                <w:szCs w:val="21"/>
-                <w:lang w:val="en-US"/>
-              </w:rPr>
-              <w:t>Pörtner</w:t>
-            </w:r>
-            <w:proofErr w:type="spellEnd"/>
-            <w:r>
-              <w:rPr>
-                <w:rFonts w:ascii="Georgia" w:eastAsia="Georgia" w:hAnsi="Georgia" w:cs="Georgia"/>
-                <w:sz w:val="21"/>
-                <w:szCs w:val="21"/>
-                <w:lang w:val="en-US"/>
-              </w:rPr>
-              <w:t xml:space="preserve">, </w:t>
+              <w:t xml:space="preserve">Huntington-Klein, N., Pörtner, </w:t>
             </w:r>
             <w:r>
               <w:rPr>
@@ -2664,29 +2447,7 @@
                   <w:sz w:val="21"/>
                   <w:szCs w:val="21"/>
                 </w:rPr>
-                <w:t xml:space="preserve">From forecasts to action: helping before </w:t>
-              </w:r>
-              <w:proofErr w:type="gramStart"/>
-              <w:r>
-                <w:rPr>
-                  <w:rStyle w:val="Hyperlink"/>
-                  <w:rFonts w:ascii="Georgia" w:hAnsi="Georgia"/>
-                  <w:color w:val="0070C0"/>
-                  <w:sz w:val="21"/>
-                  <w:szCs w:val="21"/>
-                </w:rPr>
-                <w:t>disasters</w:t>
-              </w:r>
-              <w:proofErr w:type="gramEnd"/>
-              <w:r>
-                <w:rPr>
-                  <w:rStyle w:val="Hyperlink"/>
-                  <w:rFonts w:ascii="Georgia" w:hAnsi="Georgia"/>
-                  <w:color w:val="0070C0"/>
-                  <w:sz w:val="21"/>
-                  <w:szCs w:val="21"/>
-                </w:rPr>
-                <w:t xml:space="preserve"> strike</w:t>
+                <w:t>From forecasts to action: helping before disasters strike</w:t>
               </w:r>
             </w:hyperlink>
             <w:r>
@@ -2795,29 +2556,7 @@
                 <w:sz w:val="21"/>
                 <w:szCs w:val="21"/>
               </w:rPr>
-              <w:t>Rigorous Impact Evaluation of the Trigger-Based Agricultural Micro Insurance in Vietnam (</w:t>
-            </w:r>
-            <w:proofErr w:type="spellStart"/>
-            <w:r>
-              <w:rPr>
-                <w:rFonts w:ascii="Georgia" w:eastAsia="Georgia" w:hAnsi="Georgia" w:cs="Georgia"/>
-                <w:b/>
-                <w:bCs/>
-                <w:sz w:val="21"/>
-                <w:szCs w:val="21"/>
-              </w:rPr>
-              <w:t>VietInsure</w:t>
-            </w:r>
-            <w:proofErr w:type="spellEnd"/>
-            <w:r>
-              <w:rPr>
-                <w:rFonts w:ascii="Georgia" w:eastAsia="Georgia" w:hAnsi="Georgia" w:cs="Georgia"/>
-                <w:b/>
-                <w:bCs/>
-                <w:sz w:val="21"/>
-                <w:szCs w:val="21"/>
-              </w:rPr>
-              <w:t>)</w:t>
+              <w:t>Rigorous Impact Evaluation of the Trigger-Based Agricultural Micro Insurance in Vietnam (VietInsure)</w:t>
             </w:r>
           </w:p>
           <w:p>
@@ -2994,29 +2733,7 @@
                 <w:sz w:val="21"/>
                 <w:szCs w:val="21"/>
               </w:rPr>
-              <w:t xml:space="preserve">Early Action Cash Transfers: </w:t>
-            </w:r>
-            <w:proofErr w:type="spellStart"/>
-            <w:r>
-              <w:rPr>
-                <w:rFonts w:ascii="Georgia" w:eastAsia="Georgia" w:hAnsi="Georgia" w:cs="Georgia"/>
-                <w:b/>
-                <w:bCs/>
-                <w:sz w:val="21"/>
-                <w:szCs w:val="21"/>
-              </w:rPr>
-              <w:t>Randomised</w:t>
-            </w:r>
-            <w:proofErr w:type="spellEnd"/>
-            <w:r>
-              <w:rPr>
-                <w:rFonts w:ascii="Georgia" w:eastAsia="Georgia" w:hAnsi="Georgia" w:cs="Georgia"/>
-                <w:b/>
-                <w:bCs/>
-                <w:sz w:val="21"/>
-                <w:szCs w:val="21"/>
-              </w:rPr>
-              <w:t xml:space="preserve"> impact evaluation of a new humanitarian aid instrument (CashEval)</w:t>
+              <w:t>Early Action Cash Transfers: Randomised impact evaluation of a new humanitarian aid instrument (CashEval)</w:t>
             </w:r>
           </w:p>
           <w:p>
@@ -3344,25 +3061,7 @@
                 <w:sz w:val="21"/>
                 <w:szCs w:val="21"/>
               </w:rPr>
-              <w:t>Decision support for strengthening land resilience in the face of global challenges (</w:t>
-            </w:r>
-            <w:proofErr w:type="spellStart"/>
-            <w:r>
-              <w:rPr>
-                <w:rFonts w:ascii="Georgia" w:eastAsia="Georgia" w:hAnsi="Georgia" w:cs="Georgia"/>
-                <w:sz w:val="21"/>
-                <w:szCs w:val="21"/>
-              </w:rPr>
-              <w:t>DecLaRe</w:t>
-            </w:r>
-            <w:proofErr w:type="spellEnd"/>
-            <w:r>
-              <w:rPr>
-                <w:rFonts w:ascii="Georgia" w:eastAsia="Georgia" w:hAnsi="Georgia" w:cs="Georgia"/>
-                <w:sz w:val="21"/>
-                <w:szCs w:val="21"/>
-              </w:rPr>
-              <w:t>) survey, wave 1, Ghana</w:t>
+              <w:t>Decision support for strengthening land resilience in the face of global challenges (DecLaRe) survey, wave 1, Ghana</w:t>
             </w:r>
           </w:p>
         </w:tc>
@@ -3560,25 +3259,7 @@
                 <w:sz w:val="21"/>
                 <w:szCs w:val="21"/>
               </w:rPr>
-              <w:t>Development Economics Network Berlin (</w:t>
-            </w:r>
-            <w:proofErr w:type="spellStart"/>
-            <w:r>
-              <w:rPr>
-                <w:rFonts w:ascii="Georgia" w:eastAsia="Georgia" w:hAnsi="Georgia" w:cs="Georgia"/>
-                <w:sz w:val="21"/>
-                <w:szCs w:val="21"/>
-              </w:rPr>
-              <w:t>DENeB</w:t>
-            </w:r>
-            <w:proofErr w:type="spellEnd"/>
-            <w:r>
-              <w:rPr>
-                <w:rFonts w:ascii="Georgia" w:eastAsia="Georgia" w:hAnsi="Georgia" w:cs="Georgia"/>
-                <w:sz w:val="21"/>
-                <w:szCs w:val="21"/>
-              </w:rPr>
-              <w:t>)</w:t>
+              <w:t>Development Economics Network Berlin (DENeB)</w:t>
             </w:r>
             <w:r>
               <w:rPr>
@@ -3697,23 +3378,13 @@
               </w:rPr>
               <w:t xml:space="preserve"> (</w:t>
             </w:r>
-            <w:proofErr w:type="spellStart"/>
-            <w:r>
-              <w:rPr>
-                <w:rFonts w:ascii="Georgia" w:eastAsia="Georgia" w:hAnsi="Georgia" w:cs="Georgia"/>
-                <w:sz w:val="21"/>
-                <w:szCs w:val="21"/>
-              </w:rPr>
-              <w:t>Carcavelos</w:t>
-            </w:r>
-            <w:proofErr w:type="spellEnd"/>
-            <w:r>
-              <w:rPr>
-                <w:rFonts w:ascii="Georgia" w:eastAsia="Georgia" w:hAnsi="Georgia" w:cs="Georgia"/>
-                <w:sz w:val="21"/>
-                <w:szCs w:val="21"/>
-              </w:rPr>
-              <w:t>,</w:t>
+            <w:r>
+              <w:rPr>
+                <w:rFonts w:ascii="Georgia" w:eastAsia="Georgia" w:hAnsi="Georgia" w:cs="Georgia"/>
+                <w:sz w:val="21"/>
+                <w:szCs w:val="21"/>
+              </w:rPr>
+              <w:t>Carcavelos,</w:t>
             </w:r>
             <w:r>
               <w:rPr>
@@ -3905,25 +3576,7 @@
                 <w:sz w:val="21"/>
                 <w:szCs w:val="21"/>
               </w:rPr>
-              <w:t>CELG Seminar, University of Economics (Ho Chi Minh City, VN); Association of Environmental and Resource Economists Summer Conference (Portland, ME, US); German Economic Association (</w:t>
-            </w:r>
-            <w:proofErr w:type="spellStart"/>
-            <w:r>
-              <w:rPr>
-                <w:rFonts w:ascii="Georgia" w:eastAsia="Georgia" w:hAnsi="Georgia" w:cs="Georgia"/>
-                <w:sz w:val="21"/>
-                <w:szCs w:val="21"/>
-              </w:rPr>
-              <w:t>VfS</w:t>
-            </w:r>
-            <w:proofErr w:type="spellEnd"/>
-            <w:r>
-              <w:rPr>
-                <w:rFonts w:ascii="Georgia" w:eastAsia="Georgia" w:hAnsi="Georgia" w:cs="Georgia"/>
-                <w:sz w:val="21"/>
-                <w:szCs w:val="21"/>
-              </w:rPr>
-              <w:t>) Annual Conference (Regensburg, DE)</w:t>
+              <w:t>CELG Seminar, University of Economics (Ho Chi Minh City, VN); Association of Environmental and Resource Economists Summer Conference (Portland, ME, US); German Economic Association (VfS) Annual Conference (Regensburg, DE)</w:t>
             </w:r>
             <w:r>
               <w:rPr>
@@ -4019,25 +3672,7 @@
                 <w:sz w:val="21"/>
                 <w:szCs w:val="21"/>
               </w:rPr>
-              <w:t xml:space="preserve"> Annual Conference of the European Association of Environmental and Resource Economists (Rimini, IT); Asian Economic Development Conference 2022 (virtual); </w:t>
-            </w:r>
-            <w:proofErr w:type="spellStart"/>
-            <w:r>
-              <w:rPr>
-                <w:rFonts w:ascii="Georgia" w:eastAsia="Georgia" w:hAnsi="Georgia" w:cs="Georgia"/>
-                <w:sz w:val="21"/>
-                <w:szCs w:val="21"/>
-              </w:rPr>
-              <w:t>Tropentag</w:t>
-            </w:r>
-            <w:proofErr w:type="spellEnd"/>
-            <w:r>
-              <w:rPr>
-                <w:rFonts w:ascii="Georgia" w:eastAsia="Georgia" w:hAnsi="Georgia" w:cs="Georgia"/>
-                <w:sz w:val="21"/>
-                <w:szCs w:val="21"/>
-              </w:rPr>
-              <w:t xml:space="preserve"> 2022 (Prague, CZ)</w:t>
+              <w:t xml:space="preserve"> Annual Conference of the European Association of Environmental and Resource Economists (Rimini, IT); Asian Economic Development Conference 2022 (virtual); Tropentag 2022 (Prague, CZ)</w:t>
             </w:r>
           </w:p>
         </w:tc>
@@ -4090,25 +3725,7 @@
                 <w:sz w:val="21"/>
                 <w:szCs w:val="21"/>
               </w:rPr>
-              <w:t xml:space="preserve">German Development Economics Conference 2021 (virtual); </w:t>
-            </w:r>
-            <w:proofErr w:type="spellStart"/>
-            <w:r>
-              <w:rPr>
-                <w:rFonts w:ascii="Georgia" w:eastAsia="Georgia" w:hAnsi="Georgia" w:cs="Georgia"/>
-                <w:sz w:val="21"/>
-                <w:szCs w:val="21"/>
-              </w:rPr>
-              <w:t>Tropentag</w:t>
-            </w:r>
-            <w:proofErr w:type="spellEnd"/>
-            <w:r>
-              <w:rPr>
-                <w:rFonts w:ascii="Georgia" w:eastAsia="Georgia" w:hAnsi="Georgia" w:cs="Georgia"/>
-                <w:sz w:val="21"/>
-                <w:szCs w:val="21"/>
-              </w:rPr>
-              <w:t xml:space="preserve"> 2021 (virtual)</w:t>
+              <w:t>German Development Economics Conference 2021 (virtual); Tropentag 2021 (virtual)</w:t>
             </w:r>
           </w:p>
         </w:tc>
@@ -4291,33 +3908,15 @@
                 <w:sz w:val="21"/>
                 <w:szCs w:val="21"/>
               </w:rPr>
-              <w:t xml:space="preserve">Everybody talks about evidence, but what do people really want to learn? Building a joint evidence agenda for anticipatory action at </w:t>
-            </w:r>
-            <w:proofErr w:type="gramStart"/>
-            <w:r>
-              <w:rPr>
-                <w:rFonts w:ascii="Georgia" w:eastAsia="Georgia" w:hAnsi="Georgia" w:cs="Georgia"/>
-                <w:sz w:val="21"/>
-                <w:szCs w:val="21"/>
-              </w:rPr>
-              <w:t>scale</w:t>
-            </w:r>
-            <w:r>
-              <w:rPr>
-                <w:rFonts w:ascii="Georgia" w:eastAsia="Georgia" w:hAnsi="Georgia" w:cs="Georgia"/>
-                <w:sz w:val="21"/>
-                <w:szCs w:val="21"/>
-              </w:rPr>
-              <w:t>”,</w:t>
-            </w:r>
-            <w:proofErr w:type="gramEnd"/>
-            <w:r>
-              <w:rPr>
-                <w:rFonts w:ascii="Georgia" w:eastAsia="Georgia" w:hAnsi="Georgia" w:cs="Georgia"/>
-                <w:sz w:val="21"/>
-                <w:szCs w:val="21"/>
-              </w:rPr>
-              <w:t xml:space="preserve"> GLS Berlin (Berlin, DE)</w:t>
+              <w:t>Everybody talks about evidence, but what do people really want to learn? Building a joint evidence agenda for anticipatory action at scale</w:t>
+            </w:r>
+            <w:r>
+              <w:rPr>
+                <w:rFonts w:ascii="Georgia" w:eastAsia="Georgia" w:hAnsi="Georgia" w:cs="Georgia"/>
+                <w:sz w:val="21"/>
+                <w:szCs w:val="21"/>
+              </w:rPr>
+              <w:t>”, GLS Berlin (Berlin, DE)</w:t>
             </w:r>
           </w:p>
         </w:tc>
@@ -4360,7 +3959,6 @@
                 <w:lang w:val="de-DE"/>
               </w:rPr>
             </w:pPr>
-            <w:proofErr w:type="gramStart"/>
             <w:r>
               <w:rPr>
                 <w:rFonts w:ascii="Georgia" w:eastAsia="Georgia" w:hAnsi="Georgia" w:cs="Georgia"/>
@@ -4368,17 +3966,7 @@
                 <w:szCs w:val="21"/>
                 <w:lang w:val="de-DE"/>
               </w:rPr>
-              <w:t>RWI Impuls</w:t>
-            </w:r>
-            <w:proofErr w:type="gramEnd"/>
-            <w:r>
-              <w:rPr>
-                <w:rFonts w:ascii="Georgia" w:eastAsia="Georgia" w:hAnsi="Georgia" w:cs="Georgia"/>
-                <w:sz w:val="21"/>
-                <w:szCs w:val="21"/>
-                <w:lang w:val="de-DE"/>
-              </w:rPr>
-              <w:t>: “Hilfe vor der Katastrop</w:t>
+              <w:t>RWI Impuls: “Hilfe vor der Katastrop</w:t>
             </w:r>
             <w:r>
               <w:rPr>
@@ -4476,9 +4064,8 @@
                 <w:szCs w:val="21"/>
                 <w:lang w:val="de-DE"/>
               </w:rPr>
-              <w:t xml:space="preserve">issemination </w:t>
-            </w:r>
-            <w:proofErr w:type="spellStart"/>
+              <w:t>issemination workshop of InsureVietnam research project: “Klimaanpassung für Kleinbauern in Vietnam: Neue Erkenntnisse zu Wetterversicherungen und Capacity Building aus einem rigorosen Wirkungsevaluierungsprojekt”</w:t>
+            </w:r>
             <w:r>
               <w:rPr>
                 <w:rFonts w:ascii="Georgia" w:eastAsia="Georgia" w:hAnsi="Georgia" w:cs="Georgia"/>
@@ -4486,9 +4073,8 @@
                 <w:szCs w:val="21"/>
                 <w:lang w:val="de-DE"/>
               </w:rPr>
-              <w:t>workshop</w:t>
-            </w:r>
-            <w:proofErr w:type="spellEnd"/>
+              <w:t xml:space="preserve">, </w:t>
+            </w:r>
             <w:r>
               <w:rPr>
                 <w:rFonts w:ascii="Georgia" w:eastAsia="Georgia" w:hAnsi="Georgia" w:cs="Georgia"/>
@@ -4496,9 +4082,8 @@
                 <w:szCs w:val="21"/>
                 <w:lang w:val="de-DE"/>
               </w:rPr>
-              <w:t xml:space="preserve"> of </w:t>
-            </w:r>
-            <w:proofErr w:type="spellStart"/>
+              <w:t>Deutsche Sparkassenstiftung für Internationale Kooperation</w:t>
+            </w:r>
             <w:r>
               <w:rPr>
                 <w:rFonts w:ascii="Georgia" w:eastAsia="Georgia" w:hAnsi="Georgia" w:cs="Georgia"/>
@@ -4506,9 +4091,8 @@
                 <w:szCs w:val="21"/>
                 <w:lang w:val="de-DE"/>
               </w:rPr>
-              <w:t>InsureVietnam</w:t>
-            </w:r>
-            <w:proofErr w:type="spellEnd"/>
+              <w:t xml:space="preserve"> </w:t>
+            </w:r>
             <w:r>
               <w:rPr>
                 <w:rFonts w:ascii="Georgia" w:eastAsia="Georgia" w:hAnsi="Georgia" w:cs="Georgia"/>
@@ -4516,112 +4100,7 @@
                 <w:szCs w:val="21"/>
                 <w:lang w:val="de-DE"/>
               </w:rPr>
-              <w:t xml:space="preserve"> </w:t>
-            </w:r>
-            <w:proofErr w:type="spellStart"/>
-            <w:r>
-              <w:rPr>
-                <w:rFonts w:ascii="Georgia" w:eastAsia="Georgia" w:hAnsi="Georgia" w:cs="Georgia"/>
-                <w:sz w:val="21"/>
-                <w:szCs w:val="21"/>
-                <w:lang w:val="de-DE"/>
-              </w:rPr>
-              <w:t>research</w:t>
-            </w:r>
-            <w:proofErr w:type="spellEnd"/>
-            <w:r>
-              <w:rPr>
-                <w:rFonts w:ascii="Georgia" w:eastAsia="Georgia" w:hAnsi="Georgia" w:cs="Georgia"/>
-                <w:sz w:val="21"/>
-                <w:szCs w:val="21"/>
-                <w:lang w:val="de-DE"/>
-              </w:rPr>
-              <w:t xml:space="preserve"> </w:t>
-            </w:r>
-            <w:proofErr w:type="spellStart"/>
-            <w:r>
-              <w:rPr>
-                <w:rFonts w:ascii="Georgia" w:eastAsia="Georgia" w:hAnsi="Georgia" w:cs="Georgia"/>
-                <w:sz w:val="21"/>
-                <w:szCs w:val="21"/>
-                <w:lang w:val="de-DE"/>
-              </w:rPr>
-              <w:t>project</w:t>
-            </w:r>
-            <w:proofErr w:type="spellEnd"/>
-            <w:r>
-              <w:rPr>
-                <w:rFonts w:ascii="Georgia" w:eastAsia="Georgia" w:hAnsi="Georgia" w:cs="Georgia"/>
-                <w:sz w:val="21"/>
-                <w:szCs w:val="21"/>
-                <w:lang w:val="de-DE"/>
-              </w:rPr>
-              <w:t xml:space="preserve">: “Klimaanpassung für Kleinbauern in Vietnam: Neue Erkenntnisse zu Wetterversicherungen und </w:t>
-            </w:r>
-            <w:proofErr w:type="spellStart"/>
-            <w:r>
-              <w:rPr>
-                <w:rFonts w:ascii="Georgia" w:eastAsia="Georgia" w:hAnsi="Georgia" w:cs="Georgia"/>
-                <w:sz w:val="21"/>
-                <w:szCs w:val="21"/>
-                <w:lang w:val="de-DE"/>
-              </w:rPr>
-              <w:t>Capacity</w:t>
-            </w:r>
-            <w:proofErr w:type="spellEnd"/>
-            <w:r>
-              <w:rPr>
-                <w:rFonts w:ascii="Georgia" w:eastAsia="Georgia" w:hAnsi="Georgia" w:cs="Georgia"/>
-                <w:sz w:val="21"/>
-                <w:szCs w:val="21"/>
-                <w:lang w:val="de-DE"/>
-              </w:rPr>
-              <w:t xml:space="preserve"> Building aus einem rigorosen Wirkungsevaluierungsprojekt”</w:t>
-            </w:r>
-            <w:r>
-              <w:rPr>
-                <w:rFonts w:ascii="Georgia" w:eastAsia="Georgia" w:hAnsi="Georgia" w:cs="Georgia"/>
-                <w:sz w:val="21"/>
-                <w:szCs w:val="21"/>
-                <w:lang w:val="de-DE"/>
-              </w:rPr>
-              <w:t xml:space="preserve">, </w:t>
-            </w:r>
-            <w:r>
-              <w:rPr>
-                <w:rFonts w:ascii="Georgia" w:eastAsia="Georgia" w:hAnsi="Georgia" w:cs="Georgia"/>
-                <w:sz w:val="21"/>
-                <w:szCs w:val="21"/>
-                <w:lang w:val="de-DE"/>
-              </w:rPr>
-              <w:t>Deutsche Sparkassenstiftung für Internationale Kooperation</w:t>
-            </w:r>
-            <w:r>
-              <w:rPr>
-                <w:rFonts w:ascii="Georgia" w:eastAsia="Georgia" w:hAnsi="Georgia" w:cs="Georgia"/>
-                <w:sz w:val="21"/>
-                <w:szCs w:val="21"/>
-                <w:lang w:val="de-DE"/>
-              </w:rPr>
-              <w:t xml:space="preserve"> </w:t>
-            </w:r>
-            <w:r>
-              <w:rPr>
-                <w:rFonts w:ascii="Georgia" w:eastAsia="Georgia" w:hAnsi="Georgia" w:cs="Georgia"/>
-                <w:sz w:val="21"/>
-                <w:szCs w:val="21"/>
-                <w:lang w:val="de-DE"/>
-              </w:rPr>
-              <w:t>(</w:t>
-            </w:r>
-            <w:r>
-              <w:rPr>
-                <w:rFonts w:ascii="Georgia" w:eastAsia="Georgia" w:hAnsi="Georgia" w:cs="Georgia"/>
-                <w:sz w:val="21"/>
-                <w:szCs w:val="21"/>
-                <w:lang w:val="de-DE"/>
-              </w:rPr>
-              <w:t>Bonn</w:t>
+              <w:t>(Bonn</w:t>
             </w:r>
             <w:r>
               <w:rPr>
@@ -4897,25 +4376,7 @@
                 <w:sz w:val="21"/>
                 <w:szCs w:val="21"/>
               </w:rPr>
-              <w:t xml:space="preserve">Dissemination conference of CashEval and ADAPT research projects: “Living with climate risks in Mongolia Conference”, Best Western </w:t>
-            </w:r>
-            <w:proofErr w:type="spellStart"/>
-            <w:r>
-              <w:rPr>
-                <w:rFonts w:ascii="Georgia" w:eastAsia="Georgia" w:hAnsi="Georgia" w:cs="Georgia"/>
-                <w:sz w:val="21"/>
-                <w:szCs w:val="21"/>
-              </w:rPr>
-              <w:t>Tuushin</w:t>
-            </w:r>
-            <w:proofErr w:type="spellEnd"/>
-            <w:r>
-              <w:rPr>
-                <w:rFonts w:ascii="Georgia" w:eastAsia="Georgia" w:hAnsi="Georgia" w:cs="Georgia"/>
-                <w:sz w:val="21"/>
-                <w:szCs w:val="21"/>
-              </w:rPr>
-              <w:t xml:space="preserve"> Hotel (Ulaanbaatar, MN)</w:t>
+              <w:t>Dissemination conference of CashEval and ADAPT research projects: “Living with climate risks in Mongolia Conference”, Best Western Tuushin Hotel (Ulaanbaatar, MN)</w:t>
             </w:r>
           </w:p>
         </w:tc>
@@ -5505,50 +4966,24 @@
                 <w:sz w:val="21"/>
                 <w:szCs w:val="21"/>
               </w:rPr>
+              <w:t xml:space="preserve">; </w:t>
+            </w:r>
+            <w:r>
+              <w:rPr>
+                <w:rFonts w:ascii="Georgia" w:eastAsia="Georgia" w:hAnsi="Georgia" w:cs="Georgia"/>
+                <w:sz w:val="21"/>
+                <w:szCs w:val="21"/>
+              </w:rPr>
+              <w:t>Environment and Development Economics</w:t>
+            </w:r>
+            <w:r>
+              <w:rPr>
+                <w:rFonts w:ascii="Georgia" w:eastAsia="Georgia" w:hAnsi="Georgia" w:cs="Georgia"/>
+                <w:sz w:val="21"/>
+                <w:szCs w:val="21"/>
+              </w:rPr>
               <w:t>;</w:t>
             </w:r>
-            <w:r>
-              <w:rPr>
-                <w:rFonts w:ascii="Georgia" w:eastAsia="Georgia" w:hAnsi="Georgia" w:cs="Georgia"/>
-                <w:sz w:val="21"/>
-                <w:szCs w:val="21"/>
-              </w:rPr>
-              <w:t xml:space="preserve"> </w:t>
-            </w:r>
-            <w:r>
-              <w:rPr>
-                <w:rFonts w:ascii="Georgia" w:eastAsia="Georgia" w:hAnsi="Georgia" w:cs="Georgia"/>
-                <w:sz w:val="21"/>
-                <w:szCs w:val="21"/>
-              </w:rPr>
-              <w:t xml:space="preserve">Environment and Development </w:t>
-            </w:r>
-            <w:proofErr w:type="gramStart"/>
-            <w:r>
-              <w:rPr>
-                <w:rFonts w:ascii="Georgia" w:eastAsia="Georgia" w:hAnsi="Georgia" w:cs="Georgia"/>
-                <w:sz w:val="21"/>
-                <w:szCs w:val="21"/>
-              </w:rPr>
-              <w:t>Economics</w:t>
-            </w:r>
-            <w:r>
-              <w:rPr>
-                <w:rFonts w:ascii="Georgia" w:eastAsia="Georgia" w:hAnsi="Georgia" w:cs="Georgia"/>
-                <w:sz w:val="21"/>
-                <w:szCs w:val="21"/>
-              </w:rPr>
-              <w:t>;</w:t>
-            </w:r>
-            <w:r>
-              <w:rPr>
-                <w:rFonts w:ascii="Georgia" w:eastAsia="Georgia" w:hAnsi="Georgia" w:cs="Georgia"/>
-                <w:sz w:val="21"/>
-                <w:szCs w:val="21"/>
-              </w:rPr>
-              <w:t>,</w:t>
-            </w:r>
-            <w:proofErr w:type="gramEnd"/>
             <w:r>
               <w:rPr>
                 <w:rFonts w:ascii="Georgia" w:eastAsia="Georgia" w:hAnsi="Georgia" w:cs="Georgia"/>
@@ -6367,6 +5802,7 @@
   <w:style w:type="character" w:default="1" w:styleId="DefaultParagraphFont">
     <w:name w:val="Default Paragraph Font"/>
     <w:uiPriority w:val="1"/>
+    <w:semiHidden/>
     <w:unhideWhenUsed/>
   </w:style>
   <w:style w:type="table" w:default="1" w:styleId="TableNormal">

</xml_diff>

<commit_message>
Deploying to gh-pages from @ lukasmogge/lukasmogge.github.io@f8f172e2ffbf89249a62e16cbf6e36b8e3277f7d 🚀
</commit_message>
<xml_diff>
--- a/content/CV_LM_20261025.docx
+++ b/content/CV_LM_20261025.docx
@@ -73,27 +73,7 @@
           <w:szCs w:val="24"/>
           <w:lang w:val="de-DE"/>
         </w:rPr>
-        <w:t xml:space="preserve">RWI Berlin Office, </w:t>
-      </w:r>
-      <w:proofErr w:type="spellStart"/>
-      <w:r>
-        <w:rPr>
-          <w:rFonts w:ascii="Georgia" w:eastAsia="Georgia" w:hAnsi="Georgia" w:cs="Georgia"/>
-          <w:sz w:val="24"/>
-          <w:szCs w:val="24"/>
-          <w:lang w:val="de-DE"/>
-        </w:rPr>
-        <w:t>Zinnowitzer</w:t>
-      </w:r>
-      <w:proofErr w:type="spellEnd"/>
-      <w:r>
-        <w:rPr>
-          <w:rFonts w:ascii="Georgia" w:eastAsia="Georgia" w:hAnsi="Georgia" w:cs="Georgia"/>
-          <w:sz w:val="24"/>
-          <w:szCs w:val="24"/>
-          <w:lang w:val="de-DE"/>
-        </w:rPr>
-        <w:t xml:space="preserve"> Str. 1, 10115 Berlin</w:t>
+        <w:t>RWI Berlin Office, Zinnowitzer Str. 1, 10115 Berlin</w:t>
       </w:r>
     </w:p>
     <w:p>
@@ -420,7 +400,6 @@
               <w:br/>
               <w:t xml:space="preserve">Ph.D. researcher in the </w:t>
             </w:r>
-            <w:proofErr w:type="spellStart"/>
             <w:r>
               <w:rPr>
                 <w:rFonts w:ascii="Georgia" w:eastAsia="Georgia" w:hAnsi="Georgia" w:cs="Georgia"/>
@@ -429,18 +408,7 @@
                 <w:sz w:val="21"/>
                 <w:szCs w:val="21"/>
               </w:rPr>
-              <w:t>FutureLab</w:t>
-            </w:r>
-            <w:proofErr w:type="spellEnd"/>
-            <w:r>
-              <w:rPr>
-                <w:rFonts w:ascii="Georgia" w:eastAsia="Georgia" w:hAnsi="Georgia" w:cs="Georgia"/>
-                <w:i/>
-                <w:iCs/>
-                <w:sz w:val="21"/>
-                <w:szCs w:val="21"/>
-              </w:rPr>
-              <w:t xml:space="preserve"> Inequality, Human Well-being, and Development</w:t>
+              <w:t>FutureLab Inequality, Human Well-being, and Development</w:t>
             </w:r>
           </w:p>
         </w:tc>
@@ -705,51 +673,7 @@
                 <w:sz w:val="21"/>
                 <w:szCs w:val="21"/>
               </w:rPr>
-              <w:t xml:space="preserve">Ph.D. in Economics (Dr. </w:t>
-            </w:r>
-            <w:proofErr w:type="spellStart"/>
-            <w:r>
-              <w:rPr>
-                <w:rFonts w:ascii="Georgia" w:eastAsia="Georgia" w:hAnsi="Georgia" w:cs="Georgia"/>
-                <w:b/>
-                <w:bCs/>
-                <w:sz w:val="21"/>
-                <w:szCs w:val="21"/>
-              </w:rPr>
-              <w:t>rer</w:t>
-            </w:r>
-            <w:proofErr w:type="spellEnd"/>
-            <w:r>
-              <w:rPr>
-                <w:rFonts w:ascii="Georgia" w:eastAsia="Georgia" w:hAnsi="Georgia" w:cs="Georgia"/>
-                <w:b/>
-                <w:bCs/>
-                <w:sz w:val="21"/>
-                <w:szCs w:val="21"/>
-              </w:rPr>
-              <w:t xml:space="preserve">. </w:t>
-            </w:r>
-            <w:proofErr w:type="spellStart"/>
-            <w:r>
-              <w:rPr>
-                <w:rFonts w:ascii="Georgia" w:eastAsia="Georgia" w:hAnsi="Georgia" w:cs="Georgia"/>
-                <w:b/>
-                <w:bCs/>
-                <w:sz w:val="21"/>
-                <w:szCs w:val="21"/>
-              </w:rPr>
-              <w:t>oec</w:t>
-            </w:r>
-            <w:proofErr w:type="spellEnd"/>
-            <w:r>
-              <w:rPr>
-                <w:rFonts w:ascii="Georgia" w:eastAsia="Georgia" w:hAnsi="Georgia" w:cs="Georgia"/>
-                <w:b/>
-                <w:bCs/>
-                <w:sz w:val="21"/>
-                <w:szCs w:val="21"/>
-              </w:rPr>
-              <w:t>.)</w:t>
+              <w:t>Ph.D. in Economics (Dr. rer. oec.)</w:t>
             </w:r>
             <w:r>
               <w:rPr>
@@ -1256,7 +1180,6 @@
             <w:r>
               <w:rPr>
                 <w:rFonts w:ascii="Georgia" w:eastAsia="Georgia" w:hAnsi="Georgia" w:cs="Georgia"/>
-                <w:color w:val="0070C0"/>
                 <w:sz w:val="21"/>
                 <w:szCs w:val="21"/>
                 <w:lang w:val="de-DE"/>
@@ -1307,23 +1230,7 @@
                 <w:sz w:val="21"/>
                 <w:szCs w:val="21"/>
               </w:rPr>
-              <w:t xml:space="preserve">DOI: </w:t>
-            </w:r>
-            <w:r>
-              <w:rPr>
-                <w:rFonts w:ascii="Georgia" w:eastAsia="Georgia" w:hAnsi="Georgia" w:cs="Georgia"/>
-                <w:sz w:val="21"/>
-                <w:szCs w:val="21"/>
-              </w:rPr>
-              <w:t>10.1086/735534</w:t>
-            </w:r>
-            <w:r>
-              <w:rPr>
-                <w:rFonts w:ascii="Georgia" w:eastAsia="Georgia" w:hAnsi="Georgia" w:cs="Georgia"/>
-                <w:sz w:val="21"/>
-                <w:szCs w:val="21"/>
-              </w:rPr>
-              <w:t xml:space="preserve">. </w:t>
+              <w:t xml:space="preserve">DOI: 10.1086/735534. </w:t>
             </w:r>
             <w:r>
               <w:rPr>
@@ -1499,54 +1406,10 @@
                 <w:color w:val="000000"/>
                 <w:sz w:val="21"/>
                 <w:szCs w:val="21"/>
-                <w:lang w:val="de-DE"/>
+                <w:lang w:val="en-US"/>
               </w:rPr>
               <w:lastRenderedPageBreak/>
-              <w:t xml:space="preserve">Mogge, L., McDonald, M., Knoth, C., </w:t>
-            </w:r>
-            <w:proofErr w:type="spellStart"/>
-            <w:r>
-              <w:rPr>
-                <w:rFonts w:ascii="Georgia" w:eastAsia="Georgia" w:hAnsi="Georgia" w:cs="Georgia"/>
-                <w:color w:val="000000"/>
-                <w:sz w:val="21"/>
-                <w:szCs w:val="21"/>
-                <w:lang w:val="de-DE"/>
-              </w:rPr>
-              <w:t>Teickner</w:t>
-            </w:r>
-            <w:proofErr w:type="spellEnd"/>
-            <w:r>
-              <w:rPr>
-                <w:rFonts w:ascii="Georgia" w:eastAsia="Georgia" w:hAnsi="Georgia" w:cs="Georgia"/>
-                <w:color w:val="000000"/>
-                <w:sz w:val="21"/>
-                <w:szCs w:val="21"/>
-                <w:lang w:val="de-DE"/>
-              </w:rPr>
-              <w:t xml:space="preserve">, H., Myagmartseren, P., </w:t>
-            </w:r>
-            <w:proofErr w:type="spellStart"/>
-            <w:r>
-              <w:rPr>
-                <w:rFonts w:ascii="Georgia" w:eastAsia="Georgia" w:hAnsi="Georgia" w:cs="Georgia"/>
-                <w:color w:val="000000"/>
-                <w:sz w:val="21"/>
-                <w:szCs w:val="21"/>
-                <w:lang w:val="de-DE"/>
-              </w:rPr>
-              <w:t>Pebesma</w:t>
-            </w:r>
-            <w:proofErr w:type="spellEnd"/>
-            <w:r>
-              <w:rPr>
-                <w:rFonts w:ascii="Georgia" w:eastAsia="Georgia" w:hAnsi="Georgia" w:cs="Georgia"/>
-                <w:color w:val="000000"/>
-                <w:sz w:val="21"/>
-                <w:szCs w:val="21"/>
-                <w:lang w:val="de-DE"/>
-              </w:rPr>
-              <w:t xml:space="preserve">, E. &amp; Kraehnert, K. (2023). </w:t>
+              <w:t xml:space="preserve">Mogge, L., McDonald, M., Knoth, C., Teickner, H., Myagmartseren, P., Pebesma, E. &amp; Kraehnert, K. (2023). </w:t>
             </w:r>
             <w:hyperlink r:id="rId10" w:history="1">
               <w:r>
@@ -1683,27 +1546,7 @@
                 <w:szCs w:val="21"/>
                 <w:lang w:val="de-DE"/>
               </w:rPr>
-              <w:t xml:space="preserve">Mogge, L., Roeckert, J., </w:t>
-            </w:r>
-            <w:proofErr w:type="spellStart"/>
-            <w:r>
-              <w:rPr>
-                <w:rFonts w:ascii="Georgia" w:eastAsia="Georgia" w:hAnsi="Georgia" w:cs="Georgia"/>
-                <w:sz w:val="21"/>
-                <w:szCs w:val="21"/>
-                <w:lang w:val="de-DE"/>
-              </w:rPr>
-              <w:t>Nshakira-Rukundo</w:t>
-            </w:r>
-            <w:proofErr w:type="spellEnd"/>
-            <w:r>
-              <w:rPr>
-                <w:rFonts w:ascii="Georgia" w:eastAsia="Georgia" w:hAnsi="Georgia" w:cs="Georgia"/>
-                <w:sz w:val="21"/>
-                <w:szCs w:val="21"/>
-                <w:lang w:val="de-DE"/>
-              </w:rPr>
-              <w:t>, E., &amp; Kraehnert, K. (202</w:t>
+              <w:t>Mogge, L., Roeckert, J., Nshakira-Rukundo, E., &amp; Kraehnert, K. (202</w:t>
             </w:r>
             <w:r>
               <w:rPr>
@@ -2064,29 +1907,7 @@
                 <w:szCs w:val="21"/>
                 <w:lang w:val="en-US"/>
               </w:rPr>
-              <w:t xml:space="preserve">Kraehnert, K., Habtemariam, L., </w:t>
-            </w:r>
-            <w:proofErr w:type="spellStart"/>
-            <w:r>
-              <w:rPr>
-                <w:rFonts w:ascii="Georgia" w:eastAsia="Georgia" w:hAnsi="Georgia" w:cs="Georgia"/>
-                <w:color w:val="000000"/>
-                <w:sz w:val="21"/>
-                <w:szCs w:val="21"/>
-                <w:lang w:val="en-US"/>
-              </w:rPr>
-              <w:t>Gornott</w:t>
-            </w:r>
-            <w:proofErr w:type="spellEnd"/>
-            <w:r>
-              <w:rPr>
-                <w:rFonts w:ascii="Georgia" w:eastAsia="Georgia" w:hAnsi="Georgia" w:cs="Georgia"/>
-                <w:color w:val="000000"/>
-                <w:sz w:val="21"/>
-                <w:szCs w:val="21"/>
-                <w:lang w:val="en-US"/>
-              </w:rPr>
-              <w:t>, C. &amp; Mogge, L. (2026</w:t>
+              <w:t>Kraehnert, K., Habtemariam, L., Gornott, C. &amp; Mogge, L. (2026</w:t>
             </w:r>
             <w:r>
               <w:rPr>
@@ -2132,25 +1953,7 @@
                 <w:sz w:val="21"/>
                 <w:szCs w:val="21"/>
               </w:rPr>
-              <w:t>(</w:t>
-            </w:r>
-            <w:proofErr w:type="spellStart"/>
-            <w:r>
-              <w:rPr>
-                <w:rFonts w:ascii="Georgia" w:eastAsia="Georgia" w:hAnsi="Georgia" w:cs="Georgia"/>
-                <w:sz w:val="21"/>
-                <w:szCs w:val="21"/>
-              </w:rPr>
-              <w:t>Carcavelos</w:t>
-            </w:r>
-            <w:proofErr w:type="spellEnd"/>
-            <w:r>
-              <w:rPr>
-                <w:rFonts w:ascii="Georgia" w:eastAsia="Georgia" w:hAnsi="Georgia" w:cs="Georgia"/>
-                <w:sz w:val="21"/>
-                <w:szCs w:val="21"/>
-              </w:rPr>
-              <w:t>, PT)</w:t>
+              <w:t>(Carcavelos, PT)</w:t>
             </w:r>
             <w:r>
               <w:rPr>
@@ -2184,27 +1987,7 @@
                 <w:szCs w:val="21"/>
                 <w:lang w:val="en-US"/>
               </w:rPr>
-              <w:t xml:space="preserve">Huntington-Klein, N., </w:t>
-            </w:r>
-            <w:proofErr w:type="spellStart"/>
-            <w:r>
-              <w:rPr>
-                <w:rFonts w:ascii="Georgia" w:eastAsia="Georgia" w:hAnsi="Georgia" w:cs="Georgia"/>
-                <w:sz w:val="21"/>
-                <w:szCs w:val="21"/>
-                <w:lang w:val="en-US"/>
-              </w:rPr>
-              <w:t>Pörtner</w:t>
-            </w:r>
-            <w:proofErr w:type="spellEnd"/>
-            <w:r>
-              <w:rPr>
-                <w:rFonts w:ascii="Georgia" w:eastAsia="Georgia" w:hAnsi="Georgia" w:cs="Georgia"/>
-                <w:sz w:val="21"/>
-                <w:szCs w:val="21"/>
-                <w:lang w:val="en-US"/>
-              </w:rPr>
-              <w:t xml:space="preserve">, </w:t>
+              <w:t xml:space="preserve">Huntington-Klein, N., Pörtner, </w:t>
             </w:r>
             <w:r>
               <w:rPr>
@@ -2664,29 +2447,7 @@
                   <w:sz w:val="21"/>
                   <w:szCs w:val="21"/>
                 </w:rPr>
-                <w:t xml:space="preserve">From forecasts to action: helping before </w:t>
-              </w:r>
-              <w:proofErr w:type="gramStart"/>
-              <w:r>
-                <w:rPr>
-                  <w:rStyle w:val="Hyperlink"/>
-                  <w:rFonts w:ascii="Georgia" w:hAnsi="Georgia"/>
-                  <w:color w:val="0070C0"/>
-                  <w:sz w:val="21"/>
-                  <w:szCs w:val="21"/>
-                </w:rPr>
-                <w:t>disasters</w:t>
-              </w:r>
-              <w:proofErr w:type="gramEnd"/>
-              <w:r>
-                <w:rPr>
-                  <w:rStyle w:val="Hyperlink"/>
-                  <w:rFonts w:ascii="Georgia" w:hAnsi="Georgia"/>
-                  <w:color w:val="0070C0"/>
-                  <w:sz w:val="21"/>
-                  <w:szCs w:val="21"/>
-                </w:rPr>
-                <w:t xml:space="preserve"> strike</w:t>
+                <w:t>From forecasts to action: helping before disasters strike</w:t>
               </w:r>
             </w:hyperlink>
             <w:r>
@@ -2795,29 +2556,7 @@
                 <w:sz w:val="21"/>
                 <w:szCs w:val="21"/>
               </w:rPr>
-              <w:t>Rigorous Impact Evaluation of the Trigger-Based Agricultural Micro Insurance in Vietnam (</w:t>
-            </w:r>
-            <w:proofErr w:type="spellStart"/>
-            <w:r>
-              <w:rPr>
-                <w:rFonts w:ascii="Georgia" w:eastAsia="Georgia" w:hAnsi="Georgia" w:cs="Georgia"/>
-                <w:b/>
-                <w:bCs/>
-                <w:sz w:val="21"/>
-                <w:szCs w:val="21"/>
-              </w:rPr>
-              <w:t>VietInsure</w:t>
-            </w:r>
-            <w:proofErr w:type="spellEnd"/>
-            <w:r>
-              <w:rPr>
-                <w:rFonts w:ascii="Georgia" w:eastAsia="Georgia" w:hAnsi="Georgia" w:cs="Georgia"/>
-                <w:b/>
-                <w:bCs/>
-                <w:sz w:val="21"/>
-                <w:szCs w:val="21"/>
-              </w:rPr>
-              <w:t>)</w:t>
+              <w:t>Rigorous Impact Evaluation of the Trigger-Based Agricultural Micro Insurance in Vietnam (VietInsure)</w:t>
             </w:r>
           </w:p>
           <w:p>
@@ -2994,29 +2733,7 @@
                 <w:sz w:val="21"/>
                 <w:szCs w:val="21"/>
               </w:rPr>
-              <w:t xml:space="preserve">Early Action Cash Transfers: </w:t>
-            </w:r>
-            <w:proofErr w:type="spellStart"/>
-            <w:r>
-              <w:rPr>
-                <w:rFonts w:ascii="Georgia" w:eastAsia="Georgia" w:hAnsi="Georgia" w:cs="Georgia"/>
-                <w:b/>
-                <w:bCs/>
-                <w:sz w:val="21"/>
-                <w:szCs w:val="21"/>
-              </w:rPr>
-              <w:t>Randomised</w:t>
-            </w:r>
-            <w:proofErr w:type="spellEnd"/>
-            <w:r>
-              <w:rPr>
-                <w:rFonts w:ascii="Georgia" w:eastAsia="Georgia" w:hAnsi="Georgia" w:cs="Georgia"/>
-                <w:b/>
-                <w:bCs/>
-                <w:sz w:val="21"/>
-                <w:szCs w:val="21"/>
-              </w:rPr>
-              <w:t xml:space="preserve"> impact evaluation of a new humanitarian aid instrument (CashEval)</w:t>
+              <w:t>Early Action Cash Transfers: Randomised impact evaluation of a new humanitarian aid instrument (CashEval)</w:t>
             </w:r>
           </w:p>
           <w:p>
@@ -3344,25 +3061,7 @@
                 <w:sz w:val="21"/>
                 <w:szCs w:val="21"/>
               </w:rPr>
-              <w:t>Decision support for strengthening land resilience in the face of global challenges (</w:t>
-            </w:r>
-            <w:proofErr w:type="spellStart"/>
-            <w:r>
-              <w:rPr>
-                <w:rFonts w:ascii="Georgia" w:eastAsia="Georgia" w:hAnsi="Georgia" w:cs="Georgia"/>
-                <w:sz w:val="21"/>
-                <w:szCs w:val="21"/>
-              </w:rPr>
-              <w:t>DecLaRe</w:t>
-            </w:r>
-            <w:proofErr w:type="spellEnd"/>
-            <w:r>
-              <w:rPr>
-                <w:rFonts w:ascii="Georgia" w:eastAsia="Georgia" w:hAnsi="Georgia" w:cs="Georgia"/>
-                <w:sz w:val="21"/>
-                <w:szCs w:val="21"/>
-              </w:rPr>
-              <w:t>) survey, wave 1, Ghana</w:t>
+              <w:t>Decision support for strengthening land resilience in the face of global challenges (DecLaRe) survey, wave 1, Ghana</w:t>
             </w:r>
           </w:p>
         </w:tc>
@@ -3560,25 +3259,7 @@
                 <w:sz w:val="21"/>
                 <w:szCs w:val="21"/>
               </w:rPr>
-              <w:t>Development Economics Network Berlin (</w:t>
-            </w:r>
-            <w:proofErr w:type="spellStart"/>
-            <w:r>
-              <w:rPr>
-                <w:rFonts w:ascii="Georgia" w:eastAsia="Georgia" w:hAnsi="Georgia" w:cs="Georgia"/>
-                <w:sz w:val="21"/>
-                <w:szCs w:val="21"/>
-              </w:rPr>
-              <w:t>DENeB</w:t>
-            </w:r>
-            <w:proofErr w:type="spellEnd"/>
-            <w:r>
-              <w:rPr>
-                <w:rFonts w:ascii="Georgia" w:eastAsia="Georgia" w:hAnsi="Georgia" w:cs="Georgia"/>
-                <w:sz w:val="21"/>
-                <w:szCs w:val="21"/>
-              </w:rPr>
-              <w:t>)</w:t>
+              <w:t>Development Economics Network Berlin (DENeB)</w:t>
             </w:r>
             <w:r>
               <w:rPr>
@@ -3697,23 +3378,13 @@
               </w:rPr>
               <w:t xml:space="preserve"> (</w:t>
             </w:r>
-            <w:proofErr w:type="spellStart"/>
-            <w:r>
-              <w:rPr>
-                <w:rFonts w:ascii="Georgia" w:eastAsia="Georgia" w:hAnsi="Georgia" w:cs="Georgia"/>
-                <w:sz w:val="21"/>
-                <w:szCs w:val="21"/>
-              </w:rPr>
-              <w:t>Carcavelos</w:t>
-            </w:r>
-            <w:proofErr w:type="spellEnd"/>
-            <w:r>
-              <w:rPr>
-                <w:rFonts w:ascii="Georgia" w:eastAsia="Georgia" w:hAnsi="Georgia" w:cs="Georgia"/>
-                <w:sz w:val="21"/>
-                <w:szCs w:val="21"/>
-              </w:rPr>
-              <w:t>,</w:t>
+            <w:r>
+              <w:rPr>
+                <w:rFonts w:ascii="Georgia" w:eastAsia="Georgia" w:hAnsi="Georgia" w:cs="Georgia"/>
+                <w:sz w:val="21"/>
+                <w:szCs w:val="21"/>
+              </w:rPr>
+              <w:t>Carcavelos,</w:t>
             </w:r>
             <w:r>
               <w:rPr>
@@ -3905,25 +3576,7 @@
                 <w:sz w:val="21"/>
                 <w:szCs w:val="21"/>
               </w:rPr>
-              <w:t>CELG Seminar, University of Economics (Ho Chi Minh City, VN); Association of Environmental and Resource Economists Summer Conference (Portland, ME, US); German Economic Association (</w:t>
-            </w:r>
-            <w:proofErr w:type="spellStart"/>
-            <w:r>
-              <w:rPr>
-                <w:rFonts w:ascii="Georgia" w:eastAsia="Georgia" w:hAnsi="Georgia" w:cs="Georgia"/>
-                <w:sz w:val="21"/>
-                <w:szCs w:val="21"/>
-              </w:rPr>
-              <w:t>VfS</w:t>
-            </w:r>
-            <w:proofErr w:type="spellEnd"/>
-            <w:r>
-              <w:rPr>
-                <w:rFonts w:ascii="Georgia" w:eastAsia="Georgia" w:hAnsi="Georgia" w:cs="Georgia"/>
-                <w:sz w:val="21"/>
-                <w:szCs w:val="21"/>
-              </w:rPr>
-              <w:t>) Annual Conference (Regensburg, DE)</w:t>
+              <w:t>CELG Seminar, University of Economics (Ho Chi Minh City, VN); Association of Environmental and Resource Economists Summer Conference (Portland, ME, US); German Economic Association (VfS) Annual Conference (Regensburg, DE)</w:t>
             </w:r>
             <w:r>
               <w:rPr>
@@ -4019,25 +3672,7 @@
                 <w:sz w:val="21"/>
                 <w:szCs w:val="21"/>
               </w:rPr>
-              <w:t xml:space="preserve"> Annual Conference of the European Association of Environmental and Resource Economists (Rimini, IT); Asian Economic Development Conference 2022 (virtual); </w:t>
-            </w:r>
-            <w:proofErr w:type="spellStart"/>
-            <w:r>
-              <w:rPr>
-                <w:rFonts w:ascii="Georgia" w:eastAsia="Georgia" w:hAnsi="Georgia" w:cs="Georgia"/>
-                <w:sz w:val="21"/>
-                <w:szCs w:val="21"/>
-              </w:rPr>
-              <w:t>Tropentag</w:t>
-            </w:r>
-            <w:proofErr w:type="spellEnd"/>
-            <w:r>
-              <w:rPr>
-                <w:rFonts w:ascii="Georgia" w:eastAsia="Georgia" w:hAnsi="Georgia" w:cs="Georgia"/>
-                <w:sz w:val="21"/>
-                <w:szCs w:val="21"/>
-              </w:rPr>
-              <w:t xml:space="preserve"> 2022 (Prague, CZ)</w:t>
+              <w:t xml:space="preserve"> Annual Conference of the European Association of Environmental and Resource Economists (Rimini, IT); Asian Economic Development Conference 2022 (virtual); Tropentag 2022 (Prague, CZ)</w:t>
             </w:r>
           </w:p>
         </w:tc>
@@ -4090,25 +3725,7 @@
                 <w:sz w:val="21"/>
                 <w:szCs w:val="21"/>
               </w:rPr>
-              <w:t xml:space="preserve">German Development Economics Conference 2021 (virtual); </w:t>
-            </w:r>
-            <w:proofErr w:type="spellStart"/>
-            <w:r>
-              <w:rPr>
-                <w:rFonts w:ascii="Georgia" w:eastAsia="Georgia" w:hAnsi="Georgia" w:cs="Georgia"/>
-                <w:sz w:val="21"/>
-                <w:szCs w:val="21"/>
-              </w:rPr>
-              <w:t>Tropentag</w:t>
-            </w:r>
-            <w:proofErr w:type="spellEnd"/>
-            <w:r>
-              <w:rPr>
-                <w:rFonts w:ascii="Georgia" w:eastAsia="Georgia" w:hAnsi="Georgia" w:cs="Georgia"/>
-                <w:sz w:val="21"/>
-                <w:szCs w:val="21"/>
-              </w:rPr>
-              <w:t xml:space="preserve"> 2021 (virtual)</w:t>
+              <w:t>German Development Economics Conference 2021 (virtual); Tropentag 2021 (virtual)</w:t>
             </w:r>
           </w:p>
         </w:tc>
@@ -4291,33 +3908,15 @@
                 <w:sz w:val="21"/>
                 <w:szCs w:val="21"/>
               </w:rPr>
-              <w:t xml:space="preserve">Everybody talks about evidence, but what do people really want to learn? Building a joint evidence agenda for anticipatory action at </w:t>
-            </w:r>
-            <w:proofErr w:type="gramStart"/>
-            <w:r>
-              <w:rPr>
-                <w:rFonts w:ascii="Georgia" w:eastAsia="Georgia" w:hAnsi="Georgia" w:cs="Georgia"/>
-                <w:sz w:val="21"/>
-                <w:szCs w:val="21"/>
-              </w:rPr>
-              <w:t>scale</w:t>
-            </w:r>
-            <w:r>
-              <w:rPr>
-                <w:rFonts w:ascii="Georgia" w:eastAsia="Georgia" w:hAnsi="Georgia" w:cs="Georgia"/>
-                <w:sz w:val="21"/>
-                <w:szCs w:val="21"/>
-              </w:rPr>
-              <w:t>”,</w:t>
-            </w:r>
-            <w:proofErr w:type="gramEnd"/>
-            <w:r>
-              <w:rPr>
-                <w:rFonts w:ascii="Georgia" w:eastAsia="Georgia" w:hAnsi="Georgia" w:cs="Georgia"/>
-                <w:sz w:val="21"/>
-                <w:szCs w:val="21"/>
-              </w:rPr>
-              <w:t xml:space="preserve"> GLS Berlin (Berlin, DE)</w:t>
+              <w:t>Everybody talks about evidence, but what do people really want to learn? Building a joint evidence agenda for anticipatory action at scale</w:t>
+            </w:r>
+            <w:r>
+              <w:rPr>
+                <w:rFonts w:ascii="Georgia" w:eastAsia="Georgia" w:hAnsi="Georgia" w:cs="Georgia"/>
+                <w:sz w:val="21"/>
+                <w:szCs w:val="21"/>
+              </w:rPr>
+              <w:t>”, GLS Berlin (Berlin, DE)</w:t>
             </w:r>
           </w:p>
         </w:tc>
@@ -4360,7 +3959,6 @@
                 <w:lang w:val="de-DE"/>
               </w:rPr>
             </w:pPr>
-            <w:proofErr w:type="gramStart"/>
             <w:r>
               <w:rPr>
                 <w:rFonts w:ascii="Georgia" w:eastAsia="Georgia" w:hAnsi="Georgia" w:cs="Georgia"/>
@@ -4368,17 +3966,7 @@
                 <w:szCs w:val="21"/>
                 <w:lang w:val="de-DE"/>
               </w:rPr>
-              <w:t>RWI Impuls</w:t>
-            </w:r>
-            <w:proofErr w:type="gramEnd"/>
-            <w:r>
-              <w:rPr>
-                <w:rFonts w:ascii="Georgia" w:eastAsia="Georgia" w:hAnsi="Georgia" w:cs="Georgia"/>
-                <w:sz w:val="21"/>
-                <w:szCs w:val="21"/>
-                <w:lang w:val="de-DE"/>
-              </w:rPr>
-              <w:t>: “Hilfe vor der Katastrop</w:t>
+              <w:t>RWI Impuls: “Hilfe vor der Katastrop</w:t>
             </w:r>
             <w:r>
               <w:rPr>
@@ -4476,9 +4064,8 @@
                 <w:szCs w:val="21"/>
                 <w:lang w:val="de-DE"/>
               </w:rPr>
-              <w:t xml:space="preserve">issemination </w:t>
-            </w:r>
-            <w:proofErr w:type="spellStart"/>
+              <w:t>issemination workshop of InsureVietnam research project: “Klimaanpassung für Kleinbauern in Vietnam: Neue Erkenntnisse zu Wetterversicherungen und Capacity Building aus einem rigorosen Wirkungsevaluierungsprojekt”</w:t>
+            </w:r>
             <w:r>
               <w:rPr>
                 <w:rFonts w:ascii="Georgia" w:eastAsia="Georgia" w:hAnsi="Georgia" w:cs="Georgia"/>
@@ -4486,9 +4073,8 @@
                 <w:szCs w:val="21"/>
                 <w:lang w:val="de-DE"/>
               </w:rPr>
-              <w:t>workshop</w:t>
-            </w:r>
-            <w:proofErr w:type="spellEnd"/>
+              <w:t xml:space="preserve">, </w:t>
+            </w:r>
             <w:r>
               <w:rPr>
                 <w:rFonts w:ascii="Georgia" w:eastAsia="Georgia" w:hAnsi="Georgia" w:cs="Georgia"/>
@@ -4496,9 +4082,8 @@
                 <w:szCs w:val="21"/>
                 <w:lang w:val="de-DE"/>
               </w:rPr>
-              <w:t xml:space="preserve"> of </w:t>
-            </w:r>
-            <w:proofErr w:type="spellStart"/>
+              <w:t>Deutsche Sparkassenstiftung für Internationale Kooperation</w:t>
+            </w:r>
             <w:r>
               <w:rPr>
                 <w:rFonts w:ascii="Georgia" w:eastAsia="Georgia" w:hAnsi="Georgia" w:cs="Georgia"/>
@@ -4506,9 +4091,8 @@
                 <w:szCs w:val="21"/>
                 <w:lang w:val="de-DE"/>
               </w:rPr>
-              <w:t>InsureVietnam</w:t>
-            </w:r>
-            <w:proofErr w:type="spellEnd"/>
+              <w:t xml:space="preserve"> </w:t>
+            </w:r>
             <w:r>
               <w:rPr>
                 <w:rFonts w:ascii="Georgia" w:eastAsia="Georgia" w:hAnsi="Georgia" w:cs="Georgia"/>
@@ -4516,112 +4100,7 @@
                 <w:szCs w:val="21"/>
                 <w:lang w:val="de-DE"/>
               </w:rPr>
-              <w:t xml:space="preserve"> </w:t>
-            </w:r>
-            <w:proofErr w:type="spellStart"/>
-            <w:r>
-              <w:rPr>
-                <w:rFonts w:ascii="Georgia" w:eastAsia="Georgia" w:hAnsi="Georgia" w:cs="Georgia"/>
-                <w:sz w:val="21"/>
-                <w:szCs w:val="21"/>
-                <w:lang w:val="de-DE"/>
-              </w:rPr>
-              <w:t>research</w:t>
-            </w:r>
-            <w:proofErr w:type="spellEnd"/>
-            <w:r>
-              <w:rPr>
-                <w:rFonts w:ascii="Georgia" w:eastAsia="Georgia" w:hAnsi="Georgia" w:cs="Georgia"/>
-                <w:sz w:val="21"/>
-                <w:szCs w:val="21"/>
-                <w:lang w:val="de-DE"/>
-              </w:rPr>
-              <w:t xml:space="preserve"> </w:t>
-            </w:r>
-            <w:proofErr w:type="spellStart"/>
-            <w:r>
-              <w:rPr>
-                <w:rFonts w:ascii="Georgia" w:eastAsia="Georgia" w:hAnsi="Georgia" w:cs="Georgia"/>
-                <w:sz w:val="21"/>
-                <w:szCs w:val="21"/>
-                <w:lang w:val="de-DE"/>
-              </w:rPr>
-              <w:t>project</w:t>
-            </w:r>
-            <w:proofErr w:type="spellEnd"/>
-            <w:r>
-              <w:rPr>
-                <w:rFonts w:ascii="Georgia" w:eastAsia="Georgia" w:hAnsi="Georgia" w:cs="Georgia"/>
-                <w:sz w:val="21"/>
-                <w:szCs w:val="21"/>
-                <w:lang w:val="de-DE"/>
-              </w:rPr>
-              <w:t xml:space="preserve">: “Klimaanpassung für Kleinbauern in Vietnam: Neue Erkenntnisse zu Wetterversicherungen und </w:t>
-            </w:r>
-            <w:proofErr w:type="spellStart"/>
-            <w:r>
-              <w:rPr>
-                <w:rFonts w:ascii="Georgia" w:eastAsia="Georgia" w:hAnsi="Georgia" w:cs="Georgia"/>
-                <w:sz w:val="21"/>
-                <w:szCs w:val="21"/>
-                <w:lang w:val="de-DE"/>
-              </w:rPr>
-              <w:t>Capacity</w:t>
-            </w:r>
-            <w:proofErr w:type="spellEnd"/>
-            <w:r>
-              <w:rPr>
-                <w:rFonts w:ascii="Georgia" w:eastAsia="Georgia" w:hAnsi="Georgia" w:cs="Georgia"/>
-                <w:sz w:val="21"/>
-                <w:szCs w:val="21"/>
-                <w:lang w:val="de-DE"/>
-              </w:rPr>
-              <w:t xml:space="preserve"> Building aus einem rigorosen Wirkungsevaluierungsprojekt”</w:t>
-            </w:r>
-            <w:r>
-              <w:rPr>
-                <w:rFonts w:ascii="Georgia" w:eastAsia="Georgia" w:hAnsi="Georgia" w:cs="Georgia"/>
-                <w:sz w:val="21"/>
-                <w:szCs w:val="21"/>
-                <w:lang w:val="de-DE"/>
-              </w:rPr>
-              <w:t xml:space="preserve">, </w:t>
-            </w:r>
-            <w:r>
-              <w:rPr>
-                <w:rFonts w:ascii="Georgia" w:eastAsia="Georgia" w:hAnsi="Georgia" w:cs="Georgia"/>
-                <w:sz w:val="21"/>
-                <w:szCs w:val="21"/>
-                <w:lang w:val="de-DE"/>
-              </w:rPr>
-              <w:t>Deutsche Sparkassenstiftung für Internationale Kooperation</w:t>
-            </w:r>
-            <w:r>
-              <w:rPr>
-                <w:rFonts w:ascii="Georgia" w:eastAsia="Georgia" w:hAnsi="Georgia" w:cs="Georgia"/>
-                <w:sz w:val="21"/>
-                <w:szCs w:val="21"/>
-                <w:lang w:val="de-DE"/>
-              </w:rPr>
-              <w:t xml:space="preserve"> </w:t>
-            </w:r>
-            <w:r>
-              <w:rPr>
-                <w:rFonts w:ascii="Georgia" w:eastAsia="Georgia" w:hAnsi="Georgia" w:cs="Georgia"/>
-                <w:sz w:val="21"/>
-                <w:szCs w:val="21"/>
-                <w:lang w:val="de-DE"/>
-              </w:rPr>
-              <w:t>(</w:t>
-            </w:r>
-            <w:r>
-              <w:rPr>
-                <w:rFonts w:ascii="Georgia" w:eastAsia="Georgia" w:hAnsi="Georgia" w:cs="Georgia"/>
-                <w:sz w:val="21"/>
-                <w:szCs w:val="21"/>
-                <w:lang w:val="de-DE"/>
-              </w:rPr>
-              <w:t>Bonn</w:t>
+              <w:t>(Bonn</w:t>
             </w:r>
             <w:r>
               <w:rPr>
@@ -4897,25 +4376,7 @@
                 <w:sz w:val="21"/>
                 <w:szCs w:val="21"/>
               </w:rPr>
-              <w:t xml:space="preserve">Dissemination conference of CashEval and ADAPT research projects: “Living with climate risks in Mongolia Conference”, Best Western </w:t>
-            </w:r>
-            <w:proofErr w:type="spellStart"/>
-            <w:r>
-              <w:rPr>
-                <w:rFonts w:ascii="Georgia" w:eastAsia="Georgia" w:hAnsi="Georgia" w:cs="Georgia"/>
-                <w:sz w:val="21"/>
-                <w:szCs w:val="21"/>
-              </w:rPr>
-              <w:t>Tuushin</w:t>
-            </w:r>
-            <w:proofErr w:type="spellEnd"/>
-            <w:r>
-              <w:rPr>
-                <w:rFonts w:ascii="Georgia" w:eastAsia="Georgia" w:hAnsi="Georgia" w:cs="Georgia"/>
-                <w:sz w:val="21"/>
-                <w:szCs w:val="21"/>
-              </w:rPr>
-              <w:t xml:space="preserve"> Hotel (Ulaanbaatar, MN)</w:t>
+              <w:t>Dissemination conference of CashEval and ADAPT research projects: “Living with climate risks in Mongolia Conference”, Best Western Tuushin Hotel (Ulaanbaatar, MN)</w:t>
             </w:r>
           </w:p>
         </w:tc>
@@ -5505,50 +4966,24 @@
                 <w:sz w:val="21"/>
                 <w:szCs w:val="21"/>
               </w:rPr>
+              <w:t xml:space="preserve">; </w:t>
+            </w:r>
+            <w:r>
+              <w:rPr>
+                <w:rFonts w:ascii="Georgia" w:eastAsia="Georgia" w:hAnsi="Georgia" w:cs="Georgia"/>
+                <w:sz w:val="21"/>
+                <w:szCs w:val="21"/>
+              </w:rPr>
+              <w:t>Environment and Development Economics</w:t>
+            </w:r>
+            <w:r>
+              <w:rPr>
+                <w:rFonts w:ascii="Georgia" w:eastAsia="Georgia" w:hAnsi="Georgia" w:cs="Georgia"/>
+                <w:sz w:val="21"/>
+                <w:szCs w:val="21"/>
+              </w:rPr>
               <w:t>;</w:t>
             </w:r>
-            <w:r>
-              <w:rPr>
-                <w:rFonts w:ascii="Georgia" w:eastAsia="Georgia" w:hAnsi="Georgia" w:cs="Georgia"/>
-                <w:sz w:val="21"/>
-                <w:szCs w:val="21"/>
-              </w:rPr>
-              <w:t xml:space="preserve"> </w:t>
-            </w:r>
-            <w:r>
-              <w:rPr>
-                <w:rFonts w:ascii="Georgia" w:eastAsia="Georgia" w:hAnsi="Georgia" w:cs="Georgia"/>
-                <w:sz w:val="21"/>
-                <w:szCs w:val="21"/>
-              </w:rPr>
-              <w:t xml:space="preserve">Environment and Development </w:t>
-            </w:r>
-            <w:proofErr w:type="gramStart"/>
-            <w:r>
-              <w:rPr>
-                <w:rFonts w:ascii="Georgia" w:eastAsia="Georgia" w:hAnsi="Georgia" w:cs="Georgia"/>
-                <w:sz w:val="21"/>
-                <w:szCs w:val="21"/>
-              </w:rPr>
-              <w:t>Economics</w:t>
-            </w:r>
-            <w:r>
-              <w:rPr>
-                <w:rFonts w:ascii="Georgia" w:eastAsia="Georgia" w:hAnsi="Georgia" w:cs="Georgia"/>
-                <w:sz w:val="21"/>
-                <w:szCs w:val="21"/>
-              </w:rPr>
-              <w:t>;</w:t>
-            </w:r>
-            <w:r>
-              <w:rPr>
-                <w:rFonts w:ascii="Georgia" w:eastAsia="Georgia" w:hAnsi="Georgia" w:cs="Georgia"/>
-                <w:sz w:val="21"/>
-                <w:szCs w:val="21"/>
-              </w:rPr>
-              <w:t>,</w:t>
-            </w:r>
-            <w:proofErr w:type="gramEnd"/>
             <w:r>
               <w:rPr>
                 <w:rFonts w:ascii="Georgia" w:eastAsia="Georgia" w:hAnsi="Georgia" w:cs="Georgia"/>
@@ -6367,6 +5802,7 @@
   <w:style w:type="character" w:default="1" w:styleId="DefaultParagraphFont">
     <w:name w:val="Default Paragraph Font"/>
     <w:uiPriority w:val="1"/>
+    <w:semiHidden/>
     <w:unhideWhenUsed/>
   </w:style>
   <w:style w:type="table" w:default="1" w:styleId="TableNormal">

</xml_diff>

<commit_message>
Deploying to gh-pages from @ lukasmogge/lukasmogge.github.io@fef580e4ca1ecd08956f769ee462078ffbc2c2a2 🚀
</commit_message>
<xml_diff>
--- a/content/CV_LM_20261025.docx
+++ b/content/CV_LM_20261025.docx
@@ -1935,7 +1935,38 @@
                 <w:sz w:val="21"/>
                 <w:szCs w:val="21"/>
               </w:rPr>
-              <w:t>7th World Congress of Environmental and Resource Economists</w:t>
+              <w:t>7</w:t>
+            </w:r>
+            <w:r>
+              <w:rPr>
+                <w:rFonts w:ascii="Georgia" w:eastAsia="Georgia" w:hAnsi="Georgia" w:cs="Georgia"/>
+                <w:i/>
+                <w:iCs/>
+                <w:sz w:val="21"/>
+                <w:szCs w:val="21"/>
+                <w:vertAlign w:val="superscript"/>
+              </w:rPr>
+              <w:t>th</w:t>
+            </w:r>
+            <w:r>
+              <w:rPr>
+                <w:rFonts w:ascii="Georgia" w:eastAsia="Georgia" w:hAnsi="Georgia" w:cs="Georgia"/>
+                <w:i/>
+                <w:iCs/>
+                <w:sz w:val="21"/>
+                <w:szCs w:val="21"/>
+              </w:rPr>
+              <w:t xml:space="preserve"> </w:t>
+            </w:r>
+            <w:r>
+              <w:rPr>
+                <w:rFonts w:ascii="Georgia" w:eastAsia="Georgia" w:hAnsi="Georgia" w:cs="Georgia"/>
+                <w:i/>
+                <w:iCs/>
+                <w:sz w:val="21"/>
+                <w:szCs w:val="21"/>
+              </w:rPr>
+              <w:t>World Congress of Environmental and Resource Economists</w:t>
             </w:r>
             <w:r>
               <w:rPr>
@@ -3368,7 +3399,32 @@
                 <w:sz w:val="21"/>
                 <w:szCs w:val="21"/>
               </w:rPr>
-              <w:t>7th World Congress of Environmental and Resource Economists</w:t>
+              <w:t>7</w:t>
+            </w:r>
+            <w:r>
+              <w:rPr>
+                <w:rFonts w:ascii="Georgia" w:eastAsia="Georgia" w:hAnsi="Georgia" w:cs="Georgia"/>
+                <w:sz w:val="21"/>
+                <w:szCs w:val="21"/>
+                <w:vertAlign w:val="superscript"/>
+              </w:rPr>
+              <w:t>th</w:t>
+            </w:r>
+            <w:r>
+              <w:rPr>
+                <w:rFonts w:ascii="Georgia" w:eastAsia="Georgia" w:hAnsi="Georgia" w:cs="Georgia"/>
+                <w:sz w:val="21"/>
+                <w:szCs w:val="21"/>
+              </w:rPr>
+              <w:t xml:space="preserve"> </w:t>
+            </w:r>
+            <w:r>
+              <w:rPr>
+                <w:rFonts w:ascii="Georgia" w:eastAsia="Georgia" w:hAnsi="Georgia" w:cs="Georgia"/>
+                <w:sz w:val="21"/>
+                <w:szCs w:val="21"/>
+              </w:rPr>
+              <w:t>World Congress of Environmental and Resource Economists</w:t>
             </w:r>
             <w:r>
               <w:rPr>
@@ -3401,6 +3457,46 @@
                 <w:szCs w:val="21"/>
               </w:rPr>
               <w:t>)</w:t>
+            </w:r>
+            <w:r>
+              <w:rPr>
+                <w:rFonts w:ascii="Georgia" w:eastAsia="Georgia" w:hAnsi="Georgia" w:cs="Georgia"/>
+                <w:sz w:val="21"/>
+                <w:szCs w:val="21"/>
+              </w:rPr>
+              <w:t xml:space="preserve">; </w:t>
+            </w:r>
+            <w:r>
+              <w:rPr>
+                <w:rFonts w:ascii="Georgia" w:eastAsia="Georgia" w:hAnsi="Georgia" w:cs="Georgia"/>
+                <w:sz w:val="21"/>
+                <w:szCs w:val="21"/>
+              </w:rPr>
+              <w:t xml:space="preserve">Navigating Climate Change Challenges in Developing Countries – Economic Complexities and Opportunities </w:t>
+            </w:r>
+            <w:r>
+              <w:rPr>
+                <w:rFonts w:ascii="Georgia" w:eastAsia="Georgia" w:hAnsi="Georgia" w:cs="Georgia"/>
+                <w:sz w:val="21"/>
+                <w:szCs w:val="21"/>
+              </w:rPr>
+              <w:t>W</w:t>
+            </w:r>
+            <w:r>
+              <w:rPr>
+                <w:rFonts w:ascii="Georgia" w:eastAsia="Georgia" w:hAnsi="Georgia" w:cs="Georgia"/>
+                <w:sz w:val="21"/>
+                <w:szCs w:val="21"/>
+              </w:rPr>
+              <w:t>orkshop</w:t>
+            </w:r>
+            <w:r>
+              <w:rPr>
+                <w:rFonts w:ascii="Georgia" w:eastAsia="Georgia" w:hAnsi="Georgia" w:cs="Georgia"/>
+                <w:sz w:val="21"/>
+                <w:szCs w:val="21"/>
+              </w:rPr>
+              <w:t xml:space="preserve"> by UNU-WIDER [Discussant] (Lisbon, PT</w:t>
             </w:r>
           </w:p>
         </w:tc>
@@ -3876,6 +3972,11 @@
           <w:p>
             <w:pPr>
               <w:spacing w:after="0" w:line="240" w:lineRule="auto"/>
+              <w:rPr>
+                <w:rFonts w:ascii="Georgia" w:eastAsia="Georgia" w:hAnsi="Georgia" w:cs="Georgia"/>
+                <w:sz w:val="21"/>
+                <w:szCs w:val="21"/>
+              </w:rPr>
             </w:pPr>
             <w:r>
               <w:rPr>
@@ -3934,17 +4035,17 @@
               <w:spacing w:after="0" w:line="240" w:lineRule="auto"/>
               <w:rPr>
                 <w:rFonts w:ascii="Georgia" w:eastAsia="Georgia" w:hAnsi="Georgia" w:cs="Georgia"/>
-                <w:b/>
-                <w:bCs/>
-              </w:rPr>
-            </w:pPr>
-            <w:r>
-              <w:rPr>
-                <w:rFonts w:ascii="Georgia" w:eastAsia="Georgia" w:hAnsi="Georgia" w:cs="Georgia"/>
-                <w:sz w:val="21"/>
-                <w:szCs w:val="21"/>
-              </w:rPr>
-              <w:t>07/2026</w:t>
+                <w:sz w:val="21"/>
+                <w:szCs w:val="21"/>
+              </w:rPr>
+            </w:pPr>
+            <w:r>
+              <w:rPr>
+                <w:rFonts w:ascii="Georgia" w:eastAsia="Georgia" w:hAnsi="Georgia" w:cs="Georgia"/>
+                <w:sz w:val="21"/>
+                <w:szCs w:val="21"/>
+              </w:rPr>
+              <w:t>10/2026</w:t>
             </w:r>
           </w:p>
         </w:tc>
@@ -3956,53 +4057,34 @@
             <w:pPr>
               <w:spacing w:after="0" w:line="240" w:lineRule="auto"/>
               <w:rPr>
-                <w:lang w:val="de-DE"/>
-              </w:rPr>
-            </w:pPr>
-            <w:r>
-              <w:rPr>
-                <w:rFonts w:ascii="Georgia" w:eastAsia="Georgia" w:hAnsi="Georgia" w:cs="Georgia"/>
-                <w:sz w:val="21"/>
-                <w:szCs w:val="21"/>
-                <w:lang w:val="de-DE"/>
-              </w:rPr>
-              <w:t>RWI Impuls: “Hilfe vor der Katastrop</w:t>
-            </w:r>
-            <w:r>
-              <w:rPr>
-                <w:rFonts w:ascii="Georgia" w:eastAsia="Georgia" w:hAnsi="Georgia" w:cs="Georgia"/>
-                <w:sz w:val="21"/>
-                <w:szCs w:val="21"/>
-                <w:lang w:val="de-DE"/>
-              </w:rPr>
-              <w:t>h</w:t>
-            </w:r>
-            <w:r>
-              <w:rPr>
-                <w:rFonts w:ascii="Georgia" w:eastAsia="Georgia" w:hAnsi="Georgia" w:cs="Georgia"/>
-                <w:sz w:val="21"/>
-                <w:szCs w:val="21"/>
-                <w:lang w:val="de-DE"/>
-              </w:rPr>
-              <w:t>e: Potenziale und Herausforderungen Antizipativer Humanitärer Hilfe</w:t>
-            </w:r>
-            <w:r>
-              <w:rPr>
-                <w:rFonts w:ascii="Georgia" w:eastAsia="Georgia" w:hAnsi="Georgia" w:cs="Georgia"/>
-                <w:sz w:val="21"/>
-                <w:szCs w:val="21"/>
-                <w:lang w:val="de-DE"/>
-              </w:rPr>
-              <w:t>”</w:t>
-            </w:r>
-            <w:r>
-              <w:rPr>
-                <w:rFonts w:ascii="Georgia" w:eastAsia="Georgia" w:hAnsi="Georgia" w:cs="Georgia"/>
-                <w:sz w:val="21"/>
-                <w:szCs w:val="21"/>
-                <w:lang w:val="de-DE"/>
-              </w:rPr>
-              <w:t>, RWI Berlin (Berlin, DE)</w:t>
+                <w:rFonts w:ascii="Georgia" w:eastAsia="Georgia" w:hAnsi="Georgia" w:cs="Georgia"/>
+                <w:sz w:val="21"/>
+                <w:szCs w:val="21"/>
+              </w:rPr>
+            </w:pPr>
+            <w:r>
+              <w:rPr>
+                <w:rFonts w:ascii="Georgia" w:eastAsia="Georgia" w:hAnsi="Georgia" w:cs="Georgia"/>
+                <w:sz w:val="21"/>
+                <w:szCs w:val="21"/>
+              </w:rPr>
+              <w:t>Webinar: “</w:t>
+            </w:r>
+            <w:r>
+              <w:rPr>
+                <w:rFonts w:ascii="Georgia" w:eastAsia="Georgia" w:hAnsi="Georgia" w:cs="Georgia"/>
+                <w:sz w:val="21"/>
+                <w:szCs w:val="21"/>
+              </w:rPr>
+              <w:t>Climate risk management – Evidence on an index-based insurance for smallholder farmers in Vietnam</w:t>
+            </w:r>
+            <w:r>
+              <w:rPr>
+                <w:rFonts w:ascii="Georgia" w:eastAsia="Georgia" w:hAnsi="Georgia" w:cs="Georgia"/>
+                <w:sz w:val="21"/>
+                <w:szCs w:val="21"/>
+              </w:rPr>
+              <w:t>”, organized by DEval</w:t>
             </w:r>
           </w:p>
         </w:tc>
@@ -4020,17 +4102,17 @@
               <w:spacing w:after="0" w:line="240" w:lineRule="auto"/>
               <w:rPr>
                 <w:rFonts w:ascii="Georgia" w:eastAsia="Georgia" w:hAnsi="Georgia" w:cs="Georgia"/>
-                <w:sz w:val="21"/>
-                <w:szCs w:val="21"/>
-              </w:rPr>
-            </w:pPr>
-            <w:r>
-              <w:rPr>
-                <w:rFonts w:ascii="Georgia" w:eastAsia="Georgia" w:hAnsi="Georgia" w:cs="Georgia"/>
-                <w:sz w:val="21"/>
-                <w:szCs w:val="21"/>
-              </w:rPr>
-              <w:t>06/2026</w:t>
+                <w:b/>
+                <w:bCs/>
+              </w:rPr>
+            </w:pPr>
+            <w:r>
+              <w:rPr>
+                <w:rFonts w:ascii="Georgia" w:eastAsia="Georgia" w:hAnsi="Georgia" w:cs="Georgia"/>
+                <w:sz w:val="21"/>
+                <w:szCs w:val="21"/>
+              </w:rPr>
+              <w:t>07/2026</w:t>
             </w:r>
           </w:p>
         </w:tc>
@@ -4042,9 +4124,6 @@
             <w:pPr>
               <w:spacing w:after="0" w:line="240" w:lineRule="auto"/>
               <w:rPr>
-                <w:rFonts w:ascii="Georgia" w:eastAsia="Georgia" w:hAnsi="Georgia" w:cs="Georgia"/>
-                <w:sz w:val="21"/>
-                <w:szCs w:val="21"/>
                 <w:lang w:val="de-DE"/>
               </w:rPr>
             </w:pPr>
@@ -4055,7 +4134,7 @@
                 <w:szCs w:val="21"/>
                 <w:lang w:val="de-DE"/>
               </w:rPr>
-              <w:t>D</w:t>
+              <w:t>RWI Impuls: “Hilfe vor der Katastrop</w:t>
             </w:r>
             <w:r>
               <w:rPr>
@@ -4064,7 +4143,7 @@
                 <w:szCs w:val="21"/>
                 <w:lang w:val="de-DE"/>
               </w:rPr>
-              <w:t>issemination workshop of InsureVietnam research project: “Klimaanpassung für Kleinbauern in Vietnam: Neue Erkenntnisse zu Wetterversicherungen und Capacity Building aus einem rigorosen Wirkungsevaluierungsprojekt”</w:t>
+              <w:t>h</w:t>
             </w:r>
             <w:r>
               <w:rPr>
@@ -4073,7 +4152,7 @@
                 <w:szCs w:val="21"/>
                 <w:lang w:val="de-DE"/>
               </w:rPr>
-              <w:t xml:space="preserve">, </w:t>
+              <w:t>e: Potenziale und Herausforderungen Antizipativer Humanitärer Hilfe</w:t>
             </w:r>
             <w:r>
               <w:rPr>
@@ -4082,7 +4161,7 @@
                 <w:szCs w:val="21"/>
                 <w:lang w:val="de-DE"/>
               </w:rPr>
-              <w:t>Deutsche Sparkassenstiftung für Internationale Kooperation</w:t>
+              <w:t>”</w:t>
             </w:r>
             <w:r>
               <w:rPr>
@@ -4091,34 +4170,7 @@
                 <w:szCs w:val="21"/>
                 <w:lang w:val="de-DE"/>
               </w:rPr>
-              <w:t xml:space="preserve"> </w:t>
-            </w:r>
-            <w:r>
-              <w:rPr>
-                <w:rFonts w:ascii="Georgia" w:eastAsia="Georgia" w:hAnsi="Georgia" w:cs="Georgia"/>
-                <w:sz w:val="21"/>
-                <w:szCs w:val="21"/>
-                <w:lang w:val="de-DE"/>
-              </w:rPr>
-              <w:t>(Bonn</w:t>
-            </w:r>
-            <w:r>
-              <w:rPr>
-                <w:rFonts w:ascii="Georgia" w:eastAsia="Georgia" w:hAnsi="Georgia" w:cs="Georgia"/>
-                <w:sz w:val="21"/>
-                <w:szCs w:val="21"/>
-                <w:lang w:val="de-DE"/>
-              </w:rPr>
-              <w:t>, DE</w:t>
-            </w:r>
-            <w:r>
-              <w:rPr>
-                <w:rFonts w:ascii="Georgia" w:eastAsia="Georgia" w:hAnsi="Georgia" w:cs="Georgia"/>
-                <w:sz w:val="21"/>
-                <w:szCs w:val="21"/>
-                <w:lang w:val="de-DE"/>
-              </w:rPr>
-              <w:t>)</w:t>
+              <w:t>, RWI Berlin (Berlin, DE)</w:t>
             </w:r>
           </w:p>
         </w:tc>
@@ -4147,7 +4199,7 @@
                 <w:szCs w:val="21"/>
               </w:rPr>
               <w:lastRenderedPageBreak/>
-              <w:t>11/2025</w:t>
+              <w:t>06/2026</w:t>
             </w:r>
           </w:p>
         </w:tc>
@@ -4162,15 +4214,80 @@
                 <w:rFonts w:ascii="Georgia" w:eastAsia="Georgia" w:hAnsi="Georgia" w:cs="Georgia"/>
                 <w:sz w:val="21"/>
                 <w:szCs w:val="21"/>
-              </w:rPr>
-            </w:pPr>
-            <w:r>
-              <w:rPr>
-                <w:rFonts w:ascii="Georgia" w:eastAsia="Georgia" w:hAnsi="Georgia" w:cs="Georgia"/>
-                <w:sz w:val="21"/>
-                <w:szCs w:val="21"/>
-              </w:rPr>
-              <w:t>Joint Learning Forum “Evidence That Matters: Evidence-based Development Cooperation in Strategy and Practice?”, WZB Berlin Social Science Center (Berlin, DE)</w:t>
+                <w:lang w:val="de-DE"/>
+              </w:rPr>
+            </w:pPr>
+            <w:r>
+              <w:rPr>
+                <w:rFonts w:ascii="Georgia" w:eastAsia="Georgia" w:hAnsi="Georgia" w:cs="Georgia"/>
+                <w:sz w:val="21"/>
+                <w:szCs w:val="21"/>
+                <w:lang w:val="de-DE"/>
+              </w:rPr>
+              <w:t>D</w:t>
+            </w:r>
+            <w:r>
+              <w:rPr>
+                <w:rFonts w:ascii="Georgia" w:eastAsia="Georgia" w:hAnsi="Georgia" w:cs="Georgia"/>
+                <w:sz w:val="21"/>
+                <w:szCs w:val="21"/>
+                <w:lang w:val="de-DE"/>
+              </w:rPr>
+              <w:t>issemination workshop of InsureVietnam research project: “Klimaanpassung für Kleinbauern in Vietnam: Neue Erkenntnisse zu Wetterversicherungen und Capacity Building aus einem rigorosen Wirkungsevaluierungsprojekt”</w:t>
+            </w:r>
+            <w:r>
+              <w:rPr>
+                <w:rFonts w:ascii="Georgia" w:eastAsia="Georgia" w:hAnsi="Georgia" w:cs="Georgia"/>
+                <w:sz w:val="21"/>
+                <w:szCs w:val="21"/>
+                <w:lang w:val="de-DE"/>
+              </w:rPr>
+              <w:t xml:space="preserve">, </w:t>
+            </w:r>
+            <w:r>
+              <w:rPr>
+                <w:rFonts w:ascii="Georgia" w:eastAsia="Georgia" w:hAnsi="Georgia" w:cs="Georgia"/>
+                <w:sz w:val="21"/>
+                <w:szCs w:val="21"/>
+                <w:lang w:val="de-DE"/>
+              </w:rPr>
+              <w:t>Deutsche Sparkassenstiftung für Internationale Kooperation</w:t>
+            </w:r>
+            <w:r>
+              <w:rPr>
+                <w:rFonts w:ascii="Georgia" w:eastAsia="Georgia" w:hAnsi="Georgia" w:cs="Georgia"/>
+                <w:sz w:val="21"/>
+                <w:szCs w:val="21"/>
+                <w:lang w:val="de-DE"/>
+              </w:rPr>
+              <w:t xml:space="preserve"> </w:t>
+            </w:r>
+            <w:r>
+              <w:rPr>
+                <w:rFonts w:ascii="Georgia" w:eastAsia="Georgia" w:hAnsi="Georgia" w:cs="Georgia"/>
+                <w:sz w:val="21"/>
+                <w:szCs w:val="21"/>
+                <w:lang w:val="de-DE"/>
+              </w:rPr>
+              <w:t>(Bonn</w:t>
+            </w:r>
+            <w:r>
+              <w:rPr>
+                <w:rFonts w:ascii="Georgia" w:eastAsia="Georgia" w:hAnsi="Georgia" w:cs="Georgia"/>
+                <w:sz w:val="21"/>
+                <w:szCs w:val="21"/>
+                <w:lang w:val="de-DE"/>
+              </w:rPr>
+              <w:t>, DE</w:t>
+            </w:r>
+            <w:r>
+              <w:rPr>
+                <w:rFonts w:ascii="Georgia" w:eastAsia="Georgia" w:hAnsi="Georgia" w:cs="Georgia"/>
+                <w:sz w:val="21"/>
+                <w:szCs w:val="21"/>
+                <w:lang w:val="de-DE"/>
+              </w:rPr>
+              <w:t>)</w:t>
             </w:r>
           </w:p>
         </w:tc>
@@ -4198,7 +4315,7 @@
                 <w:sz w:val="21"/>
                 <w:szCs w:val="21"/>
               </w:rPr>
-              <w:t>07/2024</w:t>
+              <w:t>11/2025</w:t>
             </w:r>
           </w:p>
         </w:tc>
@@ -4221,7 +4338,7 @@
                 <w:sz w:val="21"/>
                 <w:szCs w:val="21"/>
               </w:rPr>
-              <w:t xml:space="preserve">Webinar: “Community conversation #19: What does it take to conduct a rigorous impact evaluation of anticipatory action?”, organized by the Anticipation Hub </w:t>
+              <w:t>Joint Learning Forum “Evidence That Matters: Evidence-based Development Cooperation in Strategy and Practice?”, WZB Berlin Social Science Center (Berlin, DE)</w:t>
             </w:r>
           </w:p>
         </w:tc>
@@ -4249,7 +4366,7 @@
                 <w:sz w:val="21"/>
                 <w:szCs w:val="21"/>
               </w:rPr>
-              <w:t>06/2024</w:t>
+              <w:t>07/2024</w:t>
             </w:r>
           </w:p>
         </w:tc>
@@ -4272,7 +4389,7 @@
                 <w:sz w:val="21"/>
                 <w:szCs w:val="21"/>
               </w:rPr>
-              <w:t>What Works Climate Solutions Summit, Technical University Berlin (Berlin, DE)</w:t>
+              <w:t xml:space="preserve">Webinar: “Community conversation #19: What does it take to conduct a rigorous impact evaluation of anticipatory action?”, organized by the Anticipation Hub </w:t>
             </w:r>
           </w:p>
         </w:tc>
@@ -4300,7 +4417,7 @@
                 <w:sz w:val="21"/>
                 <w:szCs w:val="21"/>
               </w:rPr>
-              <w:t>04/2024</w:t>
+              <w:t>06/2024</w:t>
             </w:r>
           </w:p>
         </w:tc>
@@ -4323,7 +4440,7 @@
                 <w:sz w:val="21"/>
                 <w:szCs w:val="21"/>
               </w:rPr>
-              <w:t>Webinar: “Community of Practice on Climate and Disaster Risk Finance &amp; Insurance”, organized by GIZ</w:t>
+              <w:t>What Works Climate Solutions Summit, Technical University Berlin (Berlin, DE)</w:t>
             </w:r>
           </w:p>
         </w:tc>
@@ -4351,7 +4468,7 @@
                 <w:sz w:val="21"/>
                 <w:szCs w:val="21"/>
               </w:rPr>
-              <w:t>04/2023</w:t>
+              <w:t>04/2024</w:t>
             </w:r>
           </w:p>
         </w:tc>
@@ -4364,19 +4481,17 @@
               <w:spacing w:after="0" w:line="240" w:lineRule="auto"/>
               <w:rPr>
                 <w:rFonts w:ascii="Georgia" w:eastAsia="Georgia" w:hAnsi="Georgia" w:cs="Georgia"/>
-                <w:b/>
-                <w:bCs/>
-                <w:sz w:val="21"/>
-                <w:szCs w:val="21"/>
-              </w:rPr>
-            </w:pPr>
-            <w:r>
-              <w:rPr>
-                <w:rFonts w:ascii="Georgia" w:eastAsia="Georgia" w:hAnsi="Georgia" w:cs="Georgia"/>
-                <w:sz w:val="21"/>
-                <w:szCs w:val="21"/>
-              </w:rPr>
-              <w:t>Dissemination conference of CashEval and ADAPT research projects: “Living with climate risks in Mongolia Conference”, Best Western Tuushin Hotel (Ulaanbaatar, MN)</w:t>
+                <w:sz w:val="21"/>
+                <w:szCs w:val="21"/>
+              </w:rPr>
+            </w:pPr>
+            <w:r>
+              <w:rPr>
+                <w:rFonts w:ascii="Georgia" w:eastAsia="Georgia" w:hAnsi="Georgia" w:cs="Georgia"/>
+                <w:sz w:val="21"/>
+                <w:szCs w:val="21"/>
+              </w:rPr>
+              <w:t>Webinar: “Community of Practice on Climate and Disaster Risk Finance &amp; Insurance”, organized by GIZ</w:t>
             </w:r>
           </w:p>
         </w:tc>
@@ -4404,7 +4519,7 @@
                 <w:sz w:val="21"/>
                 <w:szCs w:val="21"/>
               </w:rPr>
-              <w:t>12/2022</w:t>
+              <w:t>04/2023</w:t>
             </w:r>
           </w:p>
         </w:tc>
@@ -4429,32 +4544,7 @@
                 <w:sz w:val="21"/>
                 <w:szCs w:val="21"/>
               </w:rPr>
-              <w:t>10</w:t>
-            </w:r>
-            <w:r>
-              <w:rPr>
-                <w:rFonts w:ascii="Georgia" w:eastAsia="Georgia" w:hAnsi="Georgia" w:cs="Georgia"/>
-                <w:sz w:val="21"/>
-                <w:szCs w:val="21"/>
-                <w:vertAlign w:val="superscript"/>
-              </w:rPr>
-              <w:t>th</w:t>
-            </w:r>
-            <w:r>
-              <w:rPr>
-                <w:rFonts w:ascii="Georgia" w:eastAsia="Georgia" w:hAnsi="Georgia" w:cs="Georgia"/>
-                <w:sz w:val="21"/>
-                <w:szCs w:val="21"/>
-              </w:rPr>
-              <w:t xml:space="preserve"> Global Dialogue Platform on Anticipatory Humanitarian Action: Session on “Anticipatory Action Meets Evidence: Generating Scientific Evidence on the Effectiveness of a Forecast-Based Cash Transfer Program” (virtual)</w:t>
-            </w:r>
-            <w:r>
-              <w:rPr>
-                <w:rFonts w:ascii="Georgia" w:eastAsia="Georgia" w:hAnsi="Georgia" w:cs="Georgia"/>
-                <w:sz w:val="21"/>
-                <w:szCs w:val="21"/>
-              </w:rPr>
-              <w:br/>
+              <w:t>Dissemination conference of CashEval and ADAPT research projects: “Living with climate risks in Mongolia Conference”, Best Western Tuushin Hotel (Ulaanbaatar, MN)</w:t>
             </w:r>
           </w:p>
         </w:tc>
@@ -4469,6 +4559,84 @@
           </w:tcPr>
           <w:p>
             <w:pPr>
+              <w:spacing w:after="0" w:line="240" w:lineRule="auto"/>
+              <w:rPr>
+                <w:rFonts w:ascii="Georgia" w:eastAsia="Georgia" w:hAnsi="Georgia" w:cs="Georgia"/>
+                <w:sz w:val="21"/>
+                <w:szCs w:val="21"/>
+              </w:rPr>
+            </w:pPr>
+            <w:r>
+              <w:rPr>
+                <w:rFonts w:ascii="Georgia" w:eastAsia="Georgia" w:hAnsi="Georgia" w:cs="Georgia"/>
+                <w:sz w:val="21"/>
+                <w:szCs w:val="21"/>
+              </w:rPr>
+              <w:t>12/2022</w:t>
+            </w:r>
+          </w:p>
+        </w:tc>
+        <w:tc>
+          <w:tcPr>
+            <w:tcW w:w="3889" w:type="pct"/>
+          </w:tcPr>
+          <w:p>
+            <w:pPr>
+              <w:spacing w:after="0" w:line="240" w:lineRule="auto"/>
+              <w:rPr>
+                <w:rFonts w:ascii="Georgia" w:eastAsia="Georgia" w:hAnsi="Georgia" w:cs="Georgia"/>
+                <w:b/>
+                <w:bCs/>
+                <w:sz w:val="21"/>
+                <w:szCs w:val="21"/>
+              </w:rPr>
+            </w:pPr>
+            <w:r>
+              <w:rPr>
+                <w:rFonts w:ascii="Georgia" w:eastAsia="Georgia" w:hAnsi="Georgia" w:cs="Georgia"/>
+                <w:sz w:val="21"/>
+                <w:szCs w:val="21"/>
+              </w:rPr>
+              <w:t>10</w:t>
+            </w:r>
+            <w:r>
+              <w:rPr>
+                <w:rFonts w:ascii="Georgia" w:eastAsia="Georgia" w:hAnsi="Georgia" w:cs="Georgia"/>
+                <w:sz w:val="21"/>
+                <w:szCs w:val="21"/>
+                <w:vertAlign w:val="superscript"/>
+              </w:rPr>
+              <w:t>th</w:t>
+            </w:r>
+            <w:r>
+              <w:rPr>
+                <w:rFonts w:ascii="Georgia" w:eastAsia="Georgia" w:hAnsi="Georgia" w:cs="Georgia"/>
+                <w:sz w:val="21"/>
+                <w:szCs w:val="21"/>
+              </w:rPr>
+              <w:t xml:space="preserve"> Global Dialogue Platform on Anticipatory Humanitarian Action: Session on “Anticipatory Action Meets Evidence: Generating Scientific Evidence on the Effectiveness of a Forecast-Based Cash Transfer Program” (virtual)</w:t>
+            </w:r>
+            <w:r>
+              <w:rPr>
+                <w:rFonts w:ascii="Georgia" w:eastAsia="Georgia" w:hAnsi="Georgia" w:cs="Georgia"/>
+                <w:sz w:val="21"/>
+                <w:szCs w:val="21"/>
+              </w:rPr>
+              <w:br/>
+            </w:r>
+          </w:p>
+        </w:tc>
+      </w:tr>
+      <w:tr>
+        <w:trPr>
+          <w:trHeight w:val="397"/>
+        </w:trPr>
+        <w:tc>
+          <w:tcPr>
+            <w:tcW w:w="1111" w:type="pct"/>
+          </w:tcPr>
+          <w:p>
+            <w:pPr>
               <w:spacing w:line="240" w:lineRule="auto"/>
               <w:rPr>
                 <w:rFonts w:ascii="Georgia" w:eastAsia="Georgia" w:hAnsi="Georgia" w:cs="Georgia"/>
@@ -4998,15 +5166,7 @@
                 <w:sz w:val="21"/>
                 <w:szCs w:val="21"/>
               </w:rPr>
-              <w:t>;</w:t>
-            </w:r>
-            <w:r>
-              <w:rPr>
-                <w:rFonts w:ascii="Georgia" w:eastAsia="Georgia" w:hAnsi="Georgia" w:cs="Georgia"/>
-                <w:sz w:val="21"/>
-                <w:szCs w:val="21"/>
-              </w:rPr>
-              <w:t xml:space="preserve"> </w:t>
+              <w:t xml:space="preserve">; </w:t>
             </w:r>
             <w:r>
               <w:rPr>

</xml_diff>